<commit_message>
feat: add SKPI template document and sample transcript image to public directory
</commit_message>
<xml_diff>
--- a/public/FIXED TEMPLATE SKPI USH ver.2003.docx
+++ b/public/FIXED TEMPLATE SKPI USH ver.2003.docx
@@ -76,8 +76,13 @@
               <w:spacing w:line="260" w:lineRule="exact"/>
               <w:ind w:right="715"/>
             </w:pPr>
-            <w:r>
-              <w:t>Nomor: ${NOMOR_SKPI}</w:t>
+            <w:proofErr w:type="spellStart"/>
+            <w:r>
+              <w:t>Nomor</w:t>
+            </w:r>
+            <w:proofErr w:type="spellEnd"/>
+            <w:r>
+              <w:t>: ${NOMOR_SKPI}</w:t>
             </w:r>
           </w:p>
         </w:tc>
@@ -99,7 +104,23 @@
               <w:jc w:val="both"/>
             </w:pPr>
             <w:r>
-              <w:t>Surat Keterangan Pendamping Ijazah (SKPI) ini mengacu pada Kerangka Kualifikasi Nasional Indonesia (KKNI) tentang pengakuan studi, ijazah dan gelar pendidikan tinggi. Tujuan penerbitan SKPI ini adalah menjadi dokumen yang menyatakan kemampuan kerja, penguasaan pengetahuan, dan sikap/moral pemegangnya.</w:t>
+              <w:t xml:space="preserve">Surat </w:t>
+            </w:r>
+            <w:proofErr w:type="spellStart"/>
+            <w:r>
+              <w:t>Keterangan</w:t>
+            </w:r>
+            <w:proofErr w:type="spellEnd"/>
+            <w:r>
+              <w:t xml:space="preserve"> </w:t>
+            </w:r>
+            <w:proofErr w:type="spellStart"/>
+            <w:r>
+              <w:t>Pendamping</w:t>
+            </w:r>
+            <w:proofErr w:type="spellEnd"/>
+            <w:r>
+              <w:t xml:space="preserve"> Ijazah (SKPI) ini mengacu pada Kerangka Kualifikasi Nasional Indonesia (KKNI) tentang pengakuan studi, ijazah dan gelar pendidikan tinggi. Tujuan penerbitan SKPI ini adalah menjadi dokumen yang menyatakan kemampuan kerja, penguasaan pengetahuan, dan sikap/moral pemegangnya.</w:t>
             </w:r>
           </w:p>
         </w:tc>
@@ -8117,12 +8138,7 @@
       </w:pPr>
     </w:p>
     <w:sectPr>
-      <w:headerReference w:type="even" r:id="rId9"/>
-      <w:headerReference w:type="default" r:id="rId10"/>
-      <w:footerReference w:type="even" r:id="rId11"/>
-      <w:footerReference w:type="default" r:id="rId12"/>
-      <w:headerReference w:type="first" r:id="rId13"/>
-      <w:footerReference w:type="first" r:id="rId14"/>
+      <w:headerReference w:type="default" r:id="rId9"/>
       <w:pgSz w:w="12242" w:h="18711" w:code="5"/>
       <w:pgMar w:top="1440" w:right="1440" w:bottom="1440" w:left="1440" w:header="397" w:footer="709" w:gutter="0"/>
       <w:cols w:space="708"/>
@@ -8151,36 +8167,6 @@
 </w:endnotes>
 </file>
 
-<file path=word/footer1.xml><?xml version="1.0" encoding="utf-8"?>
-<w:ftr xmlns:wpc="http://schemas.microsoft.com/office/word/2010/wordprocessingCanvas" xmlns:cx="http://schemas.microsoft.com/office/drawing/2014/chartex" xmlns:cx1="http://schemas.microsoft.com/office/drawing/2015/9/8/chartex" xmlns:cx2="http://schemas.microsoft.com/office/drawing/2015/10/21/chartex" xmlns:cx3="http://schemas.microsoft.com/office/drawing/2016/5/9/chartex" xmlns:cx4="http://schemas.microsoft.com/office/drawing/2016/5/10/chartex" xmlns:cx5="http://schemas.microsoft.com/office/drawing/2016/5/11/chartex" xmlns:cx6="http://schemas.microsoft.com/office/drawing/2016/5/12/chartex" xmlns:cx7="http://schemas.microsoft.com/office/drawing/2016/5/13/chartex" xmlns:cx8="http://schemas.microsoft.com/office/drawing/2016/5/14/chartex" xmlns:mc="http://schemas.openxmlformats.org/markup-compatibility/2006" xmlns:aink="http://schemas.microsoft.com/office/drawing/2016/ink" xmlns:am3d="http://schemas.microsoft.com/office/drawing/2017/model3d" xmlns:o="urn:schemas-microsoft-com:office:office" xmlns:oel="http://schemas.microsoft.com/office/2019/extlst" xmlns:r="http://schemas.openxmlformats.org/officeDocument/2006/relationships" xmlns:m="http://schemas.openxmlformats.org/officeDocument/2006/math" xmlns:v="urn:schemas-microsoft-com:vml" xmlns:wp14="http://schemas.microsoft.com/office/word/2010/wordprocessingDrawing" xmlns:wp="http://schemas.openxmlformats.org/drawingml/2006/wordprocessingDrawing" xmlns:w10="urn:schemas-microsoft-com:office:word" xmlns:w="http://schemas.openxmlformats.org/wordprocessingml/2006/main" xmlns:w14="http://schemas.microsoft.com/office/word/2010/wordml" xmlns:w15="http://schemas.microsoft.com/office/word/2012/wordml" xmlns:w16cex="http://schemas.microsoft.com/office/word/2018/wordml/cex" xmlns:w16cid="http://schemas.microsoft.com/office/word/2016/wordml/cid" xmlns:w16="http://schemas.microsoft.com/office/word/2018/wordml" xmlns:w16du="http://schemas.microsoft.com/office/word/2023/wordml/word16du" xmlns:w16sdtdh="http://schemas.microsoft.com/office/word/2020/wordml/sdtdatahash" xmlns:w16sdtfl="http://schemas.microsoft.com/office/word/2024/wordml/sdtformatlock" xmlns:w16se="http://schemas.microsoft.com/office/word/2015/wordml/symex" xmlns:wpg="http://schemas.microsoft.com/office/word/2010/wordprocessingGroup" xmlns:wpi="http://schemas.microsoft.com/office/word/2010/wordprocessingInk" xmlns:wne="http://schemas.microsoft.com/office/word/2006/wordml" xmlns:wps="http://schemas.microsoft.com/office/word/2010/wordprocessingShape" mc:Ignorable="w14 w15 w16se w16cid w16 w16cex w16sdtdh w16sdtfl w16du wp14">
-  <w:p>
-    <w:pPr>
-      <w:pStyle w:val="Footer"/>
-    </w:pPr>
-  </w:p>
-</w:ftr>
-</file>
-
-<file path=word/footer2.xml><?xml version="1.0" encoding="utf-8"?>
-<w:ftr xmlns:wpc="http://schemas.microsoft.com/office/word/2010/wordprocessingCanvas" xmlns:cx="http://schemas.microsoft.com/office/drawing/2014/chartex" xmlns:cx1="http://schemas.microsoft.com/office/drawing/2015/9/8/chartex" xmlns:cx2="http://schemas.microsoft.com/office/drawing/2015/10/21/chartex" xmlns:cx3="http://schemas.microsoft.com/office/drawing/2016/5/9/chartex" xmlns:cx4="http://schemas.microsoft.com/office/drawing/2016/5/10/chartex" xmlns:cx5="http://schemas.microsoft.com/office/drawing/2016/5/11/chartex" xmlns:cx6="http://schemas.microsoft.com/office/drawing/2016/5/12/chartex" xmlns:cx7="http://schemas.microsoft.com/office/drawing/2016/5/13/chartex" xmlns:cx8="http://schemas.microsoft.com/office/drawing/2016/5/14/chartex" xmlns:mc="http://schemas.openxmlformats.org/markup-compatibility/2006" xmlns:aink="http://schemas.microsoft.com/office/drawing/2016/ink" xmlns:am3d="http://schemas.microsoft.com/office/drawing/2017/model3d" xmlns:o="urn:schemas-microsoft-com:office:office" xmlns:oel="http://schemas.microsoft.com/office/2019/extlst" xmlns:r="http://schemas.openxmlformats.org/officeDocument/2006/relationships" xmlns:m="http://schemas.openxmlformats.org/officeDocument/2006/math" xmlns:v="urn:schemas-microsoft-com:vml" xmlns:wp14="http://schemas.microsoft.com/office/word/2010/wordprocessingDrawing" xmlns:wp="http://schemas.openxmlformats.org/drawingml/2006/wordprocessingDrawing" xmlns:w10="urn:schemas-microsoft-com:office:word" xmlns:w="http://schemas.openxmlformats.org/wordprocessingml/2006/main" xmlns:w14="http://schemas.microsoft.com/office/word/2010/wordml" xmlns:w15="http://schemas.microsoft.com/office/word/2012/wordml" xmlns:w16cex="http://schemas.microsoft.com/office/word/2018/wordml/cex" xmlns:w16cid="http://schemas.microsoft.com/office/word/2016/wordml/cid" xmlns:w16="http://schemas.microsoft.com/office/word/2018/wordml" xmlns:w16du="http://schemas.microsoft.com/office/word/2023/wordml/word16du" xmlns:w16sdtdh="http://schemas.microsoft.com/office/word/2020/wordml/sdtdatahash" xmlns:w16sdtfl="http://schemas.microsoft.com/office/word/2024/wordml/sdtformatlock" xmlns:w16se="http://schemas.microsoft.com/office/word/2015/wordml/symex" xmlns:wpg="http://schemas.microsoft.com/office/word/2010/wordprocessingGroup" xmlns:wpi="http://schemas.microsoft.com/office/word/2010/wordprocessingInk" xmlns:wne="http://schemas.microsoft.com/office/word/2006/wordml" xmlns:wps="http://schemas.microsoft.com/office/word/2010/wordprocessingShape" mc:Ignorable="w14 w15 w16se w16cid w16 w16cex w16sdtdh w16sdtfl w16du wp14">
-  <w:p>
-    <w:pPr>
-      <w:pStyle w:val="Footer"/>
-    </w:pPr>
-  </w:p>
-</w:ftr>
-</file>
-
-<file path=word/footer3.xml><?xml version="1.0" encoding="utf-8"?>
-<w:ftr xmlns:wpc="http://schemas.microsoft.com/office/word/2010/wordprocessingCanvas" xmlns:cx="http://schemas.microsoft.com/office/drawing/2014/chartex" xmlns:cx1="http://schemas.microsoft.com/office/drawing/2015/9/8/chartex" xmlns:cx2="http://schemas.microsoft.com/office/drawing/2015/10/21/chartex" xmlns:cx3="http://schemas.microsoft.com/office/drawing/2016/5/9/chartex" xmlns:cx4="http://schemas.microsoft.com/office/drawing/2016/5/10/chartex" xmlns:cx5="http://schemas.microsoft.com/office/drawing/2016/5/11/chartex" xmlns:cx6="http://schemas.microsoft.com/office/drawing/2016/5/12/chartex" xmlns:cx7="http://schemas.microsoft.com/office/drawing/2016/5/13/chartex" xmlns:cx8="http://schemas.microsoft.com/office/drawing/2016/5/14/chartex" xmlns:mc="http://schemas.openxmlformats.org/markup-compatibility/2006" xmlns:aink="http://schemas.microsoft.com/office/drawing/2016/ink" xmlns:am3d="http://schemas.microsoft.com/office/drawing/2017/model3d" xmlns:o="urn:schemas-microsoft-com:office:office" xmlns:oel="http://schemas.microsoft.com/office/2019/extlst" xmlns:r="http://schemas.openxmlformats.org/officeDocument/2006/relationships" xmlns:m="http://schemas.openxmlformats.org/officeDocument/2006/math" xmlns:v="urn:schemas-microsoft-com:vml" xmlns:wp14="http://schemas.microsoft.com/office/word/2010/wordprocessingDrawing" xmlns:wp="http://schemas.openxmlformats.org/drawingml/2006/wordprocessingDrawing" xmlns:w10="urn:schemas-microsoft-com:office:word" xmlns:w="http://schemas.openxmlformats.org/wordprocessingml/2006/main" xmlns:w14="http://schemas.microsoft.com/office/word/2010/wordml" xmlns:w15="http://schemas.microsoft.com/office/word/2012/wordml" xmlns:w16cex="http://schemas.microsoft.com/office/word/2018/wordml/cex" xmlns:w16cid="http://schemas.microsoft.com/office/word/2016/wordml/cid" xmlns:w16="http://schemas.microsoft.com/office/word/2018/wordml" xmlns:w16du="http://schemas.microsoft.com/office/word/2023/wordml/word16du" xmlns:w16sdtdh="http://schemas.microsoft.com/office/word/2020/wordml/sdtdatahash" xmlns:w16sdtfl="http://schemas.microsoft.com/office/word/2024/wordml/sdtformatlock" xmlns:w16se="http://schemas.microsoft.com/office/word/2015/wordml/symex" xmlns:wpg="http://schemas.microsoft.com/office/word/2010/wordprocessingGroup" xmlns:wpi="http://schemas.microsoft.com/office/word/2010/wordprocessingInk" xmlns:wne="http://schemas.microsoft.com/office/word/2006/wordml" xmlns:wps="http://schemas.microsoft.com/office/word/2010/wordprocessingShape" mc:Ignorable="w14 w15 w16se w16cid w16 w16cex w16sdtdh w16sdtfl w16du wp14">
-  <w:p>
-    <w:pPr>
-      <w:pStyle w:val="Footer"/>
-    </w:pPr>
-  </w:p>
-</w:ftr>
-</file>
-
 <file path=word/footnotes.xml><?xml version="1.0" encoding="utf-8"?>
 <w:footnotes xmlns:wpc="http://schemas.microsoft.com/office/word/2010/wordprocessingCanvas" xmlns:cx="http://schemas.microsoft.com/office/drawing/2014/chartex" xmlns:cx1="http://schemas.microsoft.com/office/drawing/2015/9/8/chartex" xmlns:cx2="http://schemas.microsoft.com/office/drawing/2015/10/21/chartex" xmlns:cx3="http://schemas.microsoft.com/office/drawing/2016/5/9/chartex" xmlns:cx4="http://schemas.microsoft.com/office/drawing/2016/5/10/chartex" xmlns:cx5="http://schemas.microsoft.com/office/drawing/2016/5/11/chartex" xmlns:cx6="http://schemas.microsoft.com/office/drawing/2016/5/12/chartex" xmlns:cx7="http://schemas.microsoft.com/office/drawing/2016/5/13/chartex" xmlns:cx8="http://schemas.microsoft.com/office/drawing/2016/5/14/chartex" xmlns:mc="http://schemas.openxmlformats.org/markup-compatibility/2006" xmlns:aink="http://schemas.microsoft.com/office/drawing/2016/ink" xmlns:am3d="http://schemas.microsoft.com/office/drawing/2017/model3d" xmlns:o="urn:schemas-microsoft-com:office:office" xmlns:oel="http://schemas.microsoft.com/office/2019/extlst" xmlns:r="http://schemas.openxmlformats.org/officeDocument/2006/relationships" xmlns:m="http://schemas.openxmlformats.org/officeDocument/2006/math" xmlns:v="urn:schemas-microsoft-com:vml" xmlns:wp14="http://schemas.microsoft.com/office/word/2010/wordprocessingDrawing" xmlns:wp="http://schemas.openxmlformats.org/drawingml/2006/wordprocessingDrawing" xmlns:w10="urn:schemas-microsoft-com:office:word" xmlns:w="http://schemas.openxmlformats.org/wordprocessingml/2006/main" xmlns:w14="http://schemas.microsoft.com/office/word/2010/wordml" xmlns:w15="http://schemas.microsoft.com/office/word/2012/wordml" xmlns:w16cex="http://schemas.microsoft.com/office/word/2018/wordml/cex" xmlns:w16cid="http://schemas.microsoft.com/office/word/2016/wordml/cid" xmlns:w16="http://schemas.microsoft.com/office/word/2018/wordml" xmlns:w16du="http://schemas.microsoft.com/office/word/2023/wordml/word16du" xmlns:w16sdtdh="http://schemas.microsoft.com/office/word/2020/wordml/sdtdatahash" xmlns:w16sdtfl="http://schemas.microsoft.com/office/word/2024/wordml/sdtformatlock" xmlns:w16se="http://schemas.microsoft.com/office/word/2015/wordml/symex" xmlns:wpg="http://schemas.microsoft.com/office/word/2010/wordprocessingGroup" xmlns:wpi="http://schemas.microsoft.com/office/word/2010/wordprocessingInk" xmlns:wne="http://schemas.microsoft.com/office/word/2006/wordml" xmlns:wps="http://schemas.microsoft.com/office/word/2010/wordprocessingShape" mc:Ignorable="w14 w15 w16se w16cid w16 w16cex w16sdtdh w16sdtfl w16du wp14">
   <w:footnote w:type="separator" w:id="-1">
@@ -8201,16 +8187,6 @@
 </file>
 
 <file path=word/header1.xml><?xml version="1.0" encoding="utf-8"?>
-<w:hdr xmlns:wpc="http://schemas.microsoft.com/office/word/2010/wordprocessingCanvas" xmlns:cx="http://schemas.microsoft.com/office/drawing/2014/chartex" xmlns:cx1="http://schemas.microsoft.com/office/drawing/2015/9/8/chartex" xmlns:cx2="http://schemas.microsoft.com/office/drawing/2015/10/21/chartex" xmlns:cx3="http://schemas.microsoft.com/office/drawing/2016/5/9/chartex" xmlns:cx4="http://schemas.microsoft.com/office/drawing/2016/5/10/chartex" xmlns:cx5="http://schemas.microsoft.com/office/drawing/2016/5/11/chartex" xmlns:cx6="http://schemas.microsoft.com/office/drawing/2016/5/12/chartex" xmlns:cx7="http://schemas.microsoft.com/office/drawing/2016/5/13/chartex" xmlns:cx8="http://schemas.microsoft.com/office/drawing/2016/5/14/chartex" xmlns:mc="http://schemas.openxmlformats.org/markup-compatibility/2006" xmlns:aink="http://schemas.microsoft.com/office/drawing/2016/ink" xmlns:am3d="http://schemas.microsoft.com/office/drawing/2017/model3d" xmlns:o="urn:schemas-microsoft-com:office:office" xmlns:oel="http://schemas.microsoft.com/office/2019/extlst" xmlns:r="http://schemas.openxmlformats.org/officeDocument/2006/relationships" xmlns:m="http://schemas.openxmlformats.org/officeDocument/2006/math" xmlns:v="urn:schemas-microsoft-com:vml" xmlns:wp14="http://schemas.microsoft.com/office/word/2010/wordprocessingDrawing" xmlns:wp="http://schemas.openxmlformats.org/drawingml/2006/wordprocessingDrawing" xmlns:w10="urn:schemas-microsoft-com:office:word" xmlns:w="http://schemas.openxmlformats.org/wordprocessingml/2006/main" xmlns:w14="http://schemas.microsoft.com/office/word/2010/wordml" xmlns:w15="http://schemas.microsoft.com/office/word/2012/wordml" xmlns:w16cex="http://schemas.microsoft.com/office/word/2018/wordml/cex" xmlns:w16cid="http://schemas.microsoft.com/office/word/2016/wordml/cid" xmlns:w16="http://schemas.microsoft.com/office/word/2018/wordml" xmlns:w16du="http://schemas.microsoft.com/office/word/2023/wordml/word16du" xmlns:w16sdtdh="http://schemas.microsoft.com/office/word/2020/wordml/sdtdatahash" xmlns:w16sdtfl="http://schemas.microsoft.com/office/word/2024/wordml/sdtformatlock" xmlns:w16se="http://schemas.microsoft.com/office/word/2015/wordml/symex" xmlns:wpg="http://schemas.microsoft.com/office/word/2010/wordprocessingGroup" xmlns:wpi="http://schemas.microsoft.com/office/word/2010/wordprocessingInk" xmlns:wne="http://schemas.microsoft.com/office/word/2006/wordml" xmlns:wps="http://schemas.microsoft.com/office/word/2010/wordprocessingShape" mc:Ignorable="w14 w15 w16se w16cid w16 w16cex w16sdtdh w16sdtfl w16du wp14">
-  <w:p>
-    <w:pPr>
-      <w:pStyle w:val="Header"/>
-    </w:pPr>
-  </w:p>
-</w:hdr>
-</file>
-
-<file path=word/header2.xml><?xml version="1.0" encoding="utf-8"?>
 <w:hdr xmlns:wpc="http://schemas.microsoft.com/office/word/2010/wordprocessingCanvas" xmlns:cx="http://schemas.microsoft.com/office/drawing/2014/chartex" xmlns:cx1="http://schemas.microsoft.com/office/drawing/2015/9/8/chartex" xmlns:cx2="http://schemas.microsoft.com/office/drawing/2015/10/21/chartex" xmlns:cx3="http://schemas.microsoft.com/office/drawing/2016/5/9/chartex" xmlns:cx4="http://schemas.microsoft.com/office/drawing/2016/5/10/chartex" xmlns:cx5="http://schemas.microsoft.com/office/drawing/2016/5/11/chartex" xmlns:cx6="http://schemas.microsoft.com/office/drawing/2016/5/12/chartex" xmlns:cx7="http://schemas.microsoft.com/office/drawing/2016/5/13/chartex" xmlns:cx8="http://schemas.microsoft.com/office/drawing/2016/5/14/chartex" xmlns:mc="http://schemas.openxmlformats.org/markup-compatibility/2006" xmlns:aink="http://schemas.microsoft.com/office/drawing/2016/ink" xmlns:am3d="http://schemas.microsoft.com/office/drawing/2017/model3d" xmlns:o="urn:schemas-microsoft-com:office:office" xmlns:oel="http://schemas.microsoft.com/office/2019/extlst" xmlns:r="http://schemas.openxmlformats.org/officeDocument/2006/relationships" xmlns:m="http://schemas.openxmlformats.org/officeDocument/2006/math" xmlns:v="urn:schemas-microsoft-com:vml" xmlns:wp14="http://schemas.microsoft.com/office/word/2010/wordprocessingDrawing" xmlns:wp="http://schemas.openxmlformats.org/drawingml/2006/wordprocessingDrawing" xmlns:w10="urn:schemas-microsoft-com:office:word" xmlns:w="http://schemas.openxmlformats.org/wordprocessingml/2006/main" xmlns:w14="http://schemas.microsoft.com/office/word/2010/wordml" xmlns:w15="http://schemas.microsoft.com/office/word/2012/wordml" xmlns:w16cex="http://schemas.microsoft.com/office/word/2018/wordml/cex" xmlns:w16cid="http://schemas.microsoft.com/office/word/2016/wordml/cid" xmlns:w16="http://schemas.microsoft.com/office/word/2018/wordml" xmlns:w16du="http://schemas.microsoft.com/office/word/2023/wordml/word16du" xmlns:w16sdtdh="http://schemas.microsoft.com/office/word/2020/wordml/sdtdatahash" xmlns:w16sdtfl="http://schemas.microsoft.com/office/word/2024/wordml/sdtformatlock" xmlns:w16se="http://schemas.microsoft.com/office/word/2015/wordml/symex" xmlns:wpg="http://schemas.microsoft.com/office/word/2010/wordprocessingGroup" xmlns:wpi="http://schemas.microsoft.com/office/word/2010/wordprocessingInk" xmlns:wne="http://schemas.microsoft.com/office/word/2006/wordml" xmlns:wps="http://schemas.microsoft.com/office/word/2010/wordprocessingShape" mc:Ignorable="w14 w15 w16se w16cid w16 w16cex w16sdtdh w16sdtfl w16du wp14">
   <w:p>
     <w:pPr>
@@ -8225,20 +8201,100 @@
     </w:pPr>
     <w:r>
       <w:rPr>
+        <w:b/>
+        <w:bCs/>
+        <w:i/>
+        <w:iCs/>
+        <w:noProof/>
+        <w:sz w:val="28"/>
+        <w:szCs w:val="28"/>
+      </w:rPr>
+      <w:drawing>
+        <wp:anchor distT="0" distB="0" distL="114300" distR="114300" simplePos="0" relativeHeight="251659264" behindDoc="1" locked="0" layoutInCell="1" allowOverlap="1" wp14:anchorId="6FA86C1C" wp14:editId="1F3B611E">
+          <wp:simplePos x="0" y="0"/>
+          <wp:positionH relativeFrom="column">
+            <wp:posOffset>-914401</wp:posOffset>
+          </wp:positionH>
+          <wp:positionV relativeFrom="paragraph">
+            <wp:posOffset>-213996</wp:posOffset>
+          </wp:positionV>
+          <wp:extent cx="7743825" cy="11886217"/>
+          <wp:effectExtent l="0" t="0" r="0" b="1270"/>
+          <wp:wrapNone/>
+          <wp:docPr id="1046271608" name="Picture 2"/>
+          <wp:cNvGraphicFramePr>
+            <a:graphicFrameLocks xmlns:a="http://schemas.openxmlformats.org/drawingml/2006/main" noChangeAspect="1"/>
+          </wp:cNvGraphicFramePr>
+          <a:graphic xmlns:a="http://schemas.openxmlformats.org/drawingml/2006/main">
+            <a:graphicData uri="http://schemas.openxmlformats.org/drawingml/2006/picture">
+              <pic:pic xmlns:pic="http://schemas.openxmlformats.org/drawingml/2006/picture">
+                <pic:nvPicPr>
+                  <pic:cNvPr id="1046271608" name="Picture 1046271608"/>
+                  <pic:cNvPicPr/>
+                </pic:nvPicPr>
+                <pic:blipFill>
+                  <a:blip r:embed="rId1">
+                    <a:extLst>
+                      <a:ext uri="{28A0092B-C50C-407E-A947-70E740481C1C}">
+                        <a14:useLocalDpi xmlns:a14="http://schemas.microsoft.com/office/drawing/2010/main" val="0"/>
+                      </a:ext>
+                    </a:extLst>
+                  </a:blip>
+                  <a:stretch>
+                    <a:fillRect/>
+                  </a:stretch>
+                </pic:blipFill>
+                <pic:spPr>
+                  <a:xfrm>
+                    <a:off x="0" y="0"/>
+                    <a:ext cx="7749081" cy="11894284"/>
+                  </a:xfrm>
+                  <a:prstGeom prst="rect">
+                    <a:avLst/>
+                  </a:prstGeom>
+                </pic:spPr>
+              </pic:pic>
+            </a:graphicData>
+          </a:graphic>
+          <wp14:sizeRelH relativeFrom="margin">
+            <wp14:pctWidth>0</wp14:pctWidth>
+          </wp14:sizeRelH>
+          <wp14:sizeRelV relativeFrom="margin">
+            <wp14:pctHeight>0</wp14:pctHeight>
+          </wp14:sizeRelV>
+        </wp:anchor>
+      </w:drawing>
+    </w:r>
+    <w:r>
+      <w:rPr>
         <w:noProof/>
       </w:rPr>
       <w:drawing>
-        <wp:anchor distT="0" distB="0" distL="114300" distR="114300" simplePos="0" relativeHeight="251657216" behindDoc="0" locked="0" layoutInCell="1" allowOverlap="1" wp14:anchorId="5D81A678" wp14:editId="2137C142">
+        <wp:anchor distT="0" distB="0" distL="114300" distR="114300" simplePos="0" relativeHeight="251657216" behindDoc="1" locked="0" layoutInCell="1" allowOverlap="1" wp14:anchorId="5D81A678" wp14:editId="4ABD0D71">
           <wp:simplePos x="0" y="0"/>
           <wp:positionH relativeFrom="column">
             <wp:posOffset>-9525</wp:posOffset>
           </wp:positionH>
           <wp:positionV relativeFrom="paragraph">
-            <wp:posOffset>-50800</wp:posOffset>
+            <wp:posOffset>-52070</wp:posOffset>
           </wp:positionV>
           <wp:extent cx="647700" cy="647700"/>
           <wp:effectExtent l="0" t="0" r="0" b="0"/>
-          <wp:wrapNone/>
+          <wp:wrapTight wrapText="bothSides">
+            <wp:wrapPolygon edited="0">
+              <wp:start x="5718" y="0"/>
+              <wp:lineTo x="0" y="3812"/>
+              <wp:lineTo x="0" y="15882"/>
+              <wp:lineTo x="4447" y="20329"/>
+              <wp:lineTo x="5718" y="20965"/>
+              <wp:lineTo x="15247" y="20965"/>
+              <wp:lineTo x="16518" y="20329"/>
+              <wp:lineTo x="20965" y="15882"/>
+              <wp:lineTo x="20965" y="3812"/>
+              <wp:lineTo x="15247" y="0"/>
+              <wp:lineTo x="5718" y="0"/>
+            </wp:wrapPolygon>
+          </wp:wrapTight>
           <wp:docPr id="1" name="Picture 3"/>
           <wp:cNvGraphicFramePr>
             <a:graphicFrameLocks xmlns:a="http://schemas.openxmlformats.org/drawingml/2006/main" noChangeAspect="1"/>
@@ -8253,7 +8309,7 @@
                   </pic:cNvPicPr>
                 </pic:nvPicPr>
                 <pic:blipFill>
-                  <a:blip r:embed="rId1">
+                  <a:blip r:embed="rId2">
                     <a:extLst>
                       <a:ext uri="{28A0092B-C50C-407E-A947-70E740481C1C}">
                         <a14:useLocalDpi xmlns:a14="http://schemas.microsoft.com/office/drawing/2010/main" val="0"/>
@@ -8320,7 +8376,7 @@
                   </pic:cNvPicPr>
                 </pic:nvPicPr>
                 <pic:blipFill>
-                  <a:blip r:embed="rId2">
+                  <a:blip r:embed="rId3">
                     <a:extLst>
                       <a:ext uri="{28A0092B-C50C-407E-A947-70E740481C1C}">
                         <a14:useLocalDpi xmlns:a14="http://schemas.microsoft.com/office/drawing/2010/main" val="0"/>
@@ -8524,16 +8580,6 @@
       </w:rPr>
       <w:t>ush@sugenghartono.ac.id</w:t>
     </w:r>
-  </w:p>
-</w:hdr>
-</file>
-
-<file path=word/header3.xml><?xml version="1.0" encoding="utf-8"?>
-<w:hdr xmlns:wpc="http://schemas.microsoft.com/office/word/2010/wordprocessingCanvas" xmlns:cx="http://schemas.microsoft.com/office/drawing/2014/chartex" xmlns:cx1="http://schemas.microsoft.com/office/drawing/2015/9/8/chartex" xmlns:cx2="http://schemas.microsoft.com/office/drawing/2015/10/21/chartex" xmlns:cx3="http://schemas.microsoft.com/office/drawing/2016/5/9/chartex" xmlns:cx4="http://schemas.microsoft.com/office/drawing/2016/5/10/chartex" xmlns:cx5="http://schemas.microsoft.com/office/drawing/2016/5/11/chartex" xmlns:cx6="http://schemas.microsoft.com/office/drawing/2016/5/12/chartex" xmlns:cx7="http://schemas.microsoft.com/office/drawing/2016/5/13/chartex" xmlns:cx8="http://schemas.microsoft.com/office/drawing/2016/5/14/chartex" xmlns:mc="http://schemas.openxmlformats.org/markup-compatibility/2006" xmlns:aink="http://schemas.microsoft.com/office/drawing/2016/ink" xmlns:am3d="http://schemas.microsoft.com/office/drawing/2017/model3d" xmlns:o="urn:schemas-microsoft-com:office:office" xmlns:oel="http://schemas.microsoft.com/office/2019/extlst" xmlns:r="http://schemas.openxmlformats.org/officeDocument/2006/relationships" xmlns:m="http://schemas.openxmlformats.org/officeDocument/2006/math" xmlns:v="urn:schemas-microsoft-com:vml" xmlns:wp14="http://schemas.microsoft.com/office/word/2010/wordprocessingDrawing" xmlns:wp="http://schemas.openxmlformats.org/drawingml/2006/wordprocessingDrawing" xmlns:w10="urn:schemas-microsoft-com:office:word" xmlns:w="http://schemas.openxmlformats.org/wordprocessingml/2006/main" xmlns:w14="http://schemas.microsoft.com/office/word/2010/wordml" xmlns:w15="http://schemas.microsoft.com/office/word/2012/wordml" xmlns:w16cex="http://schemas.microsoft.com/office/word/2018/wordml/cex" xmlns:w16cid="http://schemas.microsoft.com/office/word/2016/wordml/cid" xmlns:w16="http://schemas.microsoft.com/office/word/2018/wordml" xmlns:w16du="http://schemas.microsoft.com/office/word/2023/wordml/word16du" xmlns:w16sdtdh="http://schemas.microsoft.com/office/word/2020/wordml/sdtdatahash" xmlns:w16sdtfl="http://schemas.microsoft.com/office/word/2024/wordml/sdtformatlock" xmlns:w16se="http://schemas.microsoft.com/office/word/2015/wordml/symex" xmlns:wpg="http://schemas.microsoft.com/office/word/2010/wordprocessingGroup" xmlns:wpi="http://schemas.microsoft.com/office/word/2010/wordprocessingInk" xmlns:wne="http://schemas.microsoft.com/office/word/2006/wordml" xmlns:wps="http://schemas.microsoft.com/office/word/2010/wordprocessingShape" mc:Ignorable="w14 w15 w16se w16cid w16 w16cex w16sdtdh w16sdtfl w16du wp14">
-  <w:p>
-    <w:pPr>
-      <w:pStyle w:val="Header"/>
-    </w:pPr>
   </w:p>
 </w:hdr>
 </file>

</xml_diff>

<commit_message>
feat: add template file and background image for SKPI and transcript documentation
</commit_message>
<xml_diff>
--- a/public/FIXED TEMPLATE SKPI USH ver.2003.docx
+++ b/public/FIXED TEMPLATE SKPI USH ver.2003.docx
@@ -8203,20 +8203,18 @@
       <w:rPr>
         <w:b/>
         <w:bCs/>
-        <w:i/>
-        <w:iCs/>
         <w:noProof/>
-        <w:sz w:val="28"/>
-        <w:szCs w:val="28"/>
+        <w:sz w:val="36"/>
+        <w:szCs w:val="36"/>
       </w:rPr>
       <w:drawing>
-        <wp:anchor distT="0" distB="0" distL="114300" distR="114300" simplePos="0" relativeHeight="251659264" behindDoc="1" locked="0" layoutInCell="1" allowOverlap="1" wp14:anchorId="6FA86C1C" wp14:editId="1F3B611E">
+        <wp:anchor distT="0" distB="0" distL="114300" distR="114300" simplePos="0" relativeHeight="251659264" behindDoc="1" locked="0" layoutInCell="1" allowOverlap="1" wp14:anchorId="6FA86C1C" wp14:editId="234AEE24">
           <wp:simplePos x="0" y="0"/>
           <wp:positionH relativeFrom="column">
-            <wp:posOffset>-914401</wp:posOffset>
+            <wp:posOffset>-914213</wp:posOffset>
           </wp:positionH>
           <wp:positionV relativeFrom="paragraph">
-            <wp:posOffset>-213996</wp:posOffset>
+            <wp:posOffset>-213995</wp:posOffset>
           </wp:positionV>
           <wp:extent cx="7743825" cy="11886217"/>
           <wp:effectExtent l="0" t="0" r="0" b="1270"/>
@@ -8247,7 +8245,7 @@
                 <pic:spPr>
                   <a:xfrm>
                     <a:off x="0" y="0"/>
-                    <a:ext cx="7749081" cy="11894284"/>
+                    <a:ext cx="7743825" cy="11886217"/>
                   </a:xfrm>
                   <a:prstGeom prst="rect">
                     <a:avLst/>
@@ -8268,6 +8266,8 @@
     <w:r>
       <w:rPr>
         <w:noProof/>
+        <w:sz w:val="36"/>
+        <w:szCs w:val="36"/>
       </w:rPr>
       <w:drawing>
         <wp:anchor distT="0" distB="0" distL="114300" distR="114300" simplePos="0" relativeHeight="251657216" behindDoc="1" locked="0" layoutInCell="1" allowOverlap="1" wp14:anchorId="5D81A678" wp14:editId="4ABD0D71">
@@ -8348,137 +8348,13 @@
     </w:r>
     <w:r>
       <w:rPr>
-        <w:noProof/>
-      </w:rPr>
-      <w:drawing>
-        <wp:anchor distT="0" distB="0" distL="114300" distR="114300" simplePos="0" relativeHeight="251658240" behindDoc="0" locked="0" layoutInCell="1" allowOverlap="1" wp14:anchorId="51DC2B4D" wp14:editId="5D59FF52">
-          <wp:simplePos x="0" y="0"/>
-          <wp:positionH relativeFrom="column">
-            <wp:posOffset>5031740</wp:posOffset>
-          </wp:positionH>
-          <wp:positionV relativeFrom="paragraph">
-            <wp:posOffset>49530</wp:posOffset>
-          </wp:positionV>
-          <wp:extent cx="1170305" cy="441325"/>
-          <wp:effectExtent l="0" t="0" r="0" b="0"/>
-          <wp:wrapNone/>
-          <wp:docPr id="2" name="Picture 5" descr="Logo  Description automatically generated"/>
-          <wp:cNvGraphicFramePr>
-            <a:graphicFrameLocks xmlns:a="http://schemas.openxmlformats.org/drawingml/2006/main" noChangeAspect="1"/>
-          </wp:cNvGraphicFramePr>
-          <a:graphic xmlns:a="http://schemas.openxmlformats.org/drawingml/2006/main">
-            <a:graphicData uri="http://schemas.openxmlformats.org/drawingml/2006/picture">
-              <pic:pic xmlns:pic="http://schemas.openxmlformats.org/drawingml/2006/picture">
-                <pic:nvPicPr>
-                  <pic:cNvPr id="0" name="Picture 5" descr="Logo  Description automatically generated"/>
-                  <pic:cNvPicPr>
-                    <a:picLocks noChangeAspect="1" noChangeArrowheads="1"/>
-                  </pic:cNvPicPr>
-                </pic:nvPicPr>
-                <pic:blipFill>
-                  <a:blip r:embed="rId3">
-                    <a:extLst>
-                      <a:ext uri="{28A0092B-C50C-407E-A947-70E740481C1C}">
-                        <a14:useLocalDpi xmlns:a14="http://schemas.microsoft.com/office/drawing/2010/main" val="0"/>
-                      </a:ext>
-                    </a:extLst>
-                  </a:blip>
-                  <a:srcRect/>
-                  <a:stretch>
-                    <a:fillRect/>
-                  </a:stretch>
-                </pic:blipFill>
-                <pic:spPr bwMode="auto">
-                  <a:xfrm>
-                    <a:off x="0" y="0"/>
-                    <a:ext cx="1170305" cy="441325"/>
-                  </a:xfrm>
-                  <a:prstGeom prst="rect">
-                    <a:avLst/>
-                  </a:prstGeom>
-                  <a:noFill/>
-                  <a:ln>
-                    <a:noFill/>
-                  </a:ln>
-                </pic:spPr>
-              </pic:pic>
-            </a:graphicData>
-          </a:graphic>
-          <wp14:sizeRelH relativeFrom="page">
-            <wp14:pctWidth>0</wp14:pctWidth>
-          </wp14:sizeRelH>
-          <wp14:sizeRelV relativeFrom="page">
-            <wp14:pctHeight>0</wp14:pctHeight>
-          </wp14:sizeRelV>
-        </wp:anchor>
-      </w:drawing>
-    </w:r>
-    <w:r>
-      <w:rPr>
         <w:b/>
         <w:bCs/>
+        <w:noProof/>
         <w:sz w:val="36"/>
         <w:szCs w:val="36"/>
       </w:rPr>
-      <w:t xml:space="preserve">Universitas </w:t>
-    </w:r>
-    <w:proofErr w:type="spellStart"/>
-    <w:r>
-      <w:rPr>
-        <w:b/>
-        <w:bCs/>
-        <w:sz w:val="36"/>
-        <w:szCs w:val="36"/>
-      </w:rPr>
-      <w:t>Sugeng</w:t>
-    </w:r>
-    <w:proofErr w:type="spellEnd"/>
-    <w:r>
-      <w:rPr>
-        <w:b/>
-        <w:bCs/>
-        <w:sz w:val="36"/>
-        <w:szCs w:val="36"/>
-      </w:rPr>
-      <w:t xml:space="preserve"> Hartono</w:t>
-    </w:r>
-  </w:p>
-  <w:p>
-    <w:pPr>
-      <w:ind w:right="4"/>
-      <w:jc w:val="center"/>
-      <w:rPr>
-        <w:b/>
-        <w:bCs/>
-        <w:i/>
-        <w:iCs/>
-        <w:sz w:val="28"/>
-        <w:szCs w:val="28"/>
-      </w:rPr>
-    </w:pPr>
-    <w:proofErr w:type="spellStart"/>
-    <w:r>
-      <w:rPr>
-        <w:b/>
-        <w:bCs/>
-        <w:i/>
-        <w:iCs/>
-        <w:sz w:val="28"/>
-        <w:szCs w:val="28"/>
-      </w:rPr>
-      <w:t>Sugeng</w:t>
-    </w:r>
-    <w:proofErr w:type="spellEnd"/>
-    <w:r>
-      <w:rPr>
-        <w:b/>
-        <w:bCs/>
-        <w:i/>
-        <w:iCs/>
-        <w:sz w:val="28"/>
-        <w:szCs w:val="28"/>
-      </w:rPr>
-      <w:t xml:space="preserve"> Hartono University</w:t>
+      <w:t>UNIVERSITAS SUGENG HARTONO</w:t>
     </w:r>
   </w:p>
   <w:p>
@@ -8490,95 +8366,61 @@
         <w:szCs w:val="16"/>
       </w:rPr>
     </w:pPr>
-    <w:proofErr w:type="gramStart"/>
     <w:r>
       <w:rPr>
         <w:sz w:val="16"/>
         <w:szCs w:val="16"/>
       </w:rPr>
-      <w:t>Website :</w:t>
+      <w:t xml:space="preserve">l. Ir. Soekarno, </w:t>
     </w:r>
-    <w:proofErr w:type="gramEnd"/>
+    <w:proofErr w:type="spellStart"/>
     <w:r>
       <w:rPr>
         <w:sz w:val="16"/>
         <w:szCs w:val="16"/>
       </w:rPr>
-      <w:t xml:space="preserve"> Http://s</w:t>
+      <w:t>Madegondo</w:t>
     </w:r>
+    <w:proofErr w:type="spellEnd"/>
     <w:r>
       <w:rPr>
         <w:sz w:val="16"/>
         <w:szCs w:val="16"/>
       </w:rPr>
-      <w:t xml:space="preserve">ugenghartono.ac.id </w:t>
+      <w:t xml:space="preserve">, Grogol, </w:t>
     </w:r>
+    <w:proofErr w:type="spellStart"/>
     <w:r>
       <w:rPr>
         <w:sz w:val="16"/>
         <w:szCs w:val="16"/>
       </w:rPr>
-      <w:t xml:space="preserve">| </w:t>
+      <w:t>Sukoharjo</w:t>
     </w:r>
-    <w:proofErr w:type="gramStart"/>
+    <w:proofErr w:type="spellEnd"/>
     <w:r>
       <w:rPr>
         <w:sz w:val="16"/>
         <w:szCs w:val="16"/>
       </w:rPr>
-      <w:t>Phone :</w:t>
+      <w:t xml:space="preserve">, 57552 | Telp. +62 811-2674-670 </w:t>
     </w:r>
-    <w:proofErr w:type="gramEnd"/>
+  </w:p>
+  <w:p>
+    <w:pPr>
+      <w:ind w:right="4"/>
+      <w:jc w:val="center"/>
+      <w:rPr>
+        <w:sz w:val="16"/>
+        <w:szCs w:val="16"/>
+      </w:rPr>
+    </w:pPr>
     <w:r>
       <w:rPr>
         <w:sz w:val="16"/>
         <w:szCs w:val="16"/>
       </w:rPr>
-      <w:t xml:space="preserve"> +62</w:t>
-    </w:r>
-    <w:r>
-      <w:rPr>
-        <w:sz w:val="16"/>
-        <w:szCs w:val="16"/>
-      </w:rPr>
-      <w:t xml:space="preserve">8112674670 </w:t>
-    </w:r>
-    <w:r>
-      <w:rPr>
-        <w:sz w:val="16"/>
-        <w:szCs w:val="16"/>
-      </w:rPr>
-      <w:t xml:space="preserve">| </w:t>
-    </w:r>
-    <w:proofErr w:type="gramStart"/>
-    <w:r>
-      <w:rPr>
-        <w:sz w:val="16"/>
-        <w:szCs w:val="16"/>
-      </w:rPr>
-      <w:t>Email</w:t>
-    </w:r>
-    <w:r>
-      <w:rPr>
-        <w:sz w:val="16"/>
-        <w:szCs w:val="16"/>
-      </w:rPr>
-      <w:t xml:space="preserve"> :</w:t>
-    </w:r>
-    <w:proofErr w:type="gramEnd"/>
-    <w:r>
-      <w:rPr>
-        <w:sz w:val="16"/>
-        <w:szCs w:val="16"/>
-      </w:rPr>
-      <w:t xml:space="preserve"> </w:t>
-    </w:r>
-    <w:r>
-      <w:rPr>
-        <w:sz w:val="16"/>
-        <w:szCs w:val="16"/>
-      </w:rPr>
-      <w:t>ush@sugenghartono.ac.id</w:t>
+      <w:t xml:space="preserve">Website: www.sugenghartono.ac.id | Email: ush@sugenghartono.ac.id </w:t>
     </w:r>
   </w:p>
 </w:hdr>
@@ -11144,7 +10986,6 @@
   <w:style w:type="character" w:default="1" w:styleId="DefaultParagraphFont">
     <w:name w:val="Default Paragraph Font"/>
     <w:uiPriority w:val="1"/>
-    <w:semiHidden/>
     <w:unhideWhenUsed/>
   </w:style>
   <w:style w:type="table" w:default="1" w:styleId="TableNormal">

</xml_diff>

<commit_message>
feat: add SKPI template document to public assets
</commit_message>
<xml_diff>
--- a/public/FIXED TEMPLATE SKPI USH ver.2003.docx
+++ b/public/FIXED TEMPLATE SKPI USH ver.2003.docx
@@ -8138,7 +8138,12 @@
       </w:pPr>
     </w:p>
     <w:sectPr>
-      <w:headerReference w:type="default" r:id="rId9"/>
+      <w:headerReference w:type="even" r:id="rId9"/>
+      <w:headerReference w:type="default" r:id="rId10"/>
+      <w:footerReference w:type="even" r:id="rId11"/>
+      <w:footerReference w:type="default" r:id="rId12"/>
+      <w:headerReference w:type="first" r:id="rId13"/>
+      <w:footerReference w:type="first" r:id="rId14"/>
       <w:pgSz w:w="12242" w:h="18711" w:code="5"/>
       <w:pgMar w:top="1440" w:right="1440" w:bottom="1440" w:left="1440" w:header="397" w:footer="709" w:gutter="0"/>
       <w:cols w:space="708"/>
@@ -8167,6 +8172,36 @@
 </w:endnotes>
 </file>
 
+<file path=word/footer1.xml><?xml version="1.0" encoding="utf-8"?>
+<w:ftr xmlns:wpc="http://schemas.microsoft.com/office/word/2010/wordprocessingCanvas" xmlns:cx="http://schemas.microsoft.com/office/drawing/2014/chartex" xmlns:cx1="http://schemas.microsoft.com/office/drawing/2015/9/8/chartex" xmlns:cx2="http://schemas.microsoft.com/office/drawing/2015/10/21/chartex" xmlns:cx3="http://schemas.microsoft.com/office/drawing/2016/5/9/chartex" xmlns:cx4="http://schemas.microsoft.com/office/drawing/2016/5/10/chartex" xmlns:cx5="http://schemas.microsoft.com/office/drawing/2016/5/11/chartex" xmlns:cx6="http://schemas.microsoft.com/office/drawing/2016/5/12/chartex" xmlns:cx7="http://schemas.microsoft.com/office/drawing/2016/5/13/chartex" xmlns:cx8="http://schemas.microsoft.com/office/drawing/2016/5/14/chartex" xmlns:mc="http://schemas.openxmlformats.org/markup-compatibility/2006" xmlns:aink="http://schemas.microsoft.com/office/drawing/2016/ink" xmlns:am3d="http://schemas.microsoft.com/office/drawing/2017/model3d" xmlns:o="urn:schemas-microsoft-com:office:office" xmlns:oel="http://schemas.microsoft.com/office/2019/extlst" xmlns:r="http://schemas.openxmlformats.org/officeDocument/2006/relationships" xmlns:m="http://schemas.openxmlformats.org/officeDocument/2006/math" xmlns:v="urn:schemas-microsoft-com:vml" xmlns:wp14="http://schemas.microsoft.com/office/word/2010/wordprocessingDrawing" xmlns:wp="http://schemas.openxmlformats.org/drawingml/2006/wordprocessingDrawing" xmlns:w10="urn:schemas-microsoft-com:office:word" xmlns:w="http://schemas.openxmlformats.org/wordprocessingml/2006/main" xmlns:w14="http://schemas.microsoft.com/office/word/2010/wordml" xmlns:w15="http://schemas.microsoft.com/office/word/2012/wordml" xmlns:w16cex="http://schemas.microsoft.com/office/word/2018/wordml/cex" xmlns:w16cid="http://schemas.microsoft.com/office/word/2016/wordml/cid" xmlns:w16="http://schemas.microsoft.com/office/word/2018/wordml" xmlns:w16du="http://schemas.microsoft.com/office/word/2023/wordml/word16du" xmlns:w16sdtdh="http://schemas.microsoft.com/office/word/2020/wordml/sdtdatahash" xmlns:w16sdtfl="http://schemas.microsoft.com/office/word/2024/wordml/sdtformatlock" xmlns:w16se="http://schemas.microsoft.com/office/word/2015/wordml/symex" xmlns:wpg="http://schemas.microsoft.com/office/word/2010/wordprocessingGroup" xmlns:wpi="http://schemas.microsoft.com/office/word/2010/wordprocessingInk" xmlns:wne="http://schemas.microsoft.com/office/word/2006/wordml" xmlns:wps="http://schemas.microsoft.com/office/word/2010/wordprocessingShape" mc:Ignorable="w14 w15 w16se w16cid w16 w16cex w16sdtdh w16sdtfl w16du wp14">
+  <w:p>
+    <w:pPr>
+      <w:pStyle w:val="Footer"/>
+    </w:pPr>
+  </w:p>
+</w:ftr>
+</file>
+
+<file path=word/footer2.xml><?xml version="1.0" encoding="utf-8"?>
+<w:ftr xmlns:wpc="http://schemas.microsoft.com/office/word/2010/wordprocessingCanvas" xmlns:cx="http://schemas.microsoft.com/office/drawing/2014/chartex" xmlns:cx1="http://schemas.microsoft.com/office/drawing/2015/9/8/chartex" xmlns:cx2="http://schemas.microsoft.com/office/drawing/2015/10/21/chartex" xmlns:cx3="http://schemas.microsoft.com/office/drawing/2016/5/9/chartex" xmlns:cx4="http://schemas.microsoft.com/office/drawing/2016/5/10/chartex" xmlns:cx5="http://schemas.microsoft.com/office/drawing/2016/5/11/chartex" xmlns:cx6="http://schemas.microsoft.com/office/drawing/2016/5/12/chartex" xmlns:cx7="http://schemas.microsoft.com/office/drawing/2016/5/13/chartex" xmlns:cx8="http://schemas.microsoft.com/office/drawing/2016/5/14/chartex" xmlns:mc="http://schemas.openxmlformats.org/markup-compatibility/2006" xmlns:aink="http://schemas.microsoft.com/office/drawing/2016/ink" xmlns:am3d="http://schemas.microsoft.com/office/drawing/2017/model3d" xmlns:o="urn:schemas-microsoft-com:office:office" xmlns:oel="http://schemas.microsoft.com/office/2019/extlst" xmlns:r="http://schemas.openxmlformats.org/officeDocument/2006/relationships" xmlns:m="http://schemas.openxmlformats.org/officeDocument/2006/math" xmlns:v="urn:schemas-microsoft-com:vml" xmlns:wp14="http://schemas.microsoft.com/office/word/2010/wordprocessingDrawing" xmlns:wp="http://schemas.openxmlformats.org/drawingml/2006/wordprocessingDrawing" xmlns:w10="urn:schemas-microsoft-com:office:word" xmlns:w="http://schemas.openxmlformats.org/wordprocessingml/2006/main" xmlns:w14="http://schemas.microsoft.com/office/word/2010/wordml" xmlns:w15="http://schemas.microsoft.com/office/word/2012/wordml" xmlns:w16cex="http://schemas.microsoft.com/office/word/2018/wordml/cex" xmlns:w16cid="http://schemas.microsoft.com/office/word/2016/wordml/cid" xmlns:w16="http://schemas.microsoft.com/office/word/2018/wordml" xmlns:w16du="http://schemas.microsoft.com/office/word/2023/wordml/word16du" xmlns:w16sdtdh="http://schemas.microsoft.com/office/word/2020/wordml/sdtdatahash" xmlns:w16sdtfl="http://schemas.microsoft.com/office/word/2024/wordml/sdtformatlock" xmlns:w16se="http://schemas.microsoft.com/office/word/2015/wordml/symex" xmlns:wpg="http://schemas.microsoft.com/office/word/2010/wordprocessingGroup" xmlns:wpi="http://schemas.microsoft.com/office/word/2010/wordprocessingInk" xmlns:wne="http://schemas.microsoft.com/office/word/2006/wordml" xmlns:wps="http://schemas.microsoft.com/office/word/2010/wordprocessingShape" mc:Ignorable="w14 w15 w16se w16cid w16 w16cex w16sdtdh w16sdtfl w16du wp14">
+  <w:p>
+    <w:pPr>
+      <w:pStyle w:val="Footer"/>
+    </w:pPr>
+  </w:p>
+</w:ftr>
+</file>
+
+<file path=word/footer3.xml><?xml version="1.0" encoding="utf-8"?>
+<w:ftr xmlns:wpc="http://schemas.microsoft.com/office/word/2010/wordprocessingCanvas" xmlns:cx="http://schemas.microsoft.com/office/drawing/2014/chartex" xmlns:cx1="http://schemas.microsoft.com/office/drawing/2015/9/8/chartex" xmlns:cx2="http://schemas.microsoft.com/office/drawing/2015/10/21/chartex" xmlns:cx3="http://schemas.microsoft.com/office/drawing/2016/5/9/chartex" xmlns:cx4="http://schemas.microsoft.com/office/drawing/2016/5/10/chartex" xmlns:cx5="http://schemas.microsoft.com/office/drawing/2016/5/11/chartex" xmlns:cx6="http://schemas.microsoft.com/office/drawing/2016/5/12/chartex" xmlns:cx7="http://schemas.microsoft.com/office/drawing/2016/5/13/chartex" xmlns:cx8="http://schemas.microsoft.com/office/drawing/2016/5/14/chartex" xmlns:mc="http://schemas.openxmlformats.org/markup-compatibility/2006" xmlns:aink="http://schemas.microsoft.com/office/drawing/2016/ink" xmlns:am3d="http://schemas.microsoft.com/office/drawing/2017/model3d" xmlns:o="urn:schemas-microsoft-com:office:office" xmlns:oel="http://schemas.microsoft.com/office/2019/extlst" xmlns:r="http://schemas.openxmlformats.org/officeDocument/2006/relationships" xmlns:m="http://schemas.openxmlformats.org/officeDocument/2006/math" xmlns:v="urn:schemas-microsoft-com:vml" xmlns:wp14="http://schemas.microsoft.com/office/word/2010/wordprocessingDrawing" xmlns:wp="http://schemas.openxmlformats.org/drawingml/2006/wordprocessingDrawing" xmlns:w10="urn:schemas-microsoft-com:office:word" xmlns:w="http://schemas.openxmlformats.org/wordprocessingml/2006/main" xmlns:w14="http://schemas.microsoft.com/office/word/2010/wordml" xmlns:w15="http://schemas.microsoft.com/office/word/2012/wordml" xmlns:w16cex="http://schemas.microsoft.com/office/word/2018/wordml/cex" xmlns:w16cid="http://schemas.microsoft.com/office/word/2016/wordml/cid" xmlns:w16="http://schemas.microsoft.com/office/word/2018/wordml" xmlns:w16du="http://schemas.microsoft.com/office/word/2023/wordml/word16du" xmlns:w16sdtdh="http://schemas.microsoft.com/office/word/2020/wordml/sdtdatahash" xmlns:w16sdtfl="http://schemas.microsoft.com/office/word/2024/wordml/sdtformatlock" xmlns:w16se="http://schemas.microsoft.com/office/word/2015/wordml/symex" xmlns:wpg="http://schemas.microsoft.com/office/word/2010/wordprocessingGroup" xmlns:wpi="http://schemas.microsoft.com/office/word/2010/wordprocessingInk" xmlns:wne="http://schemas.microsoft.com/office/word/2006/wordml" xmlns:wps="http://schemas.microsoft.com/office/word/2010/wordprocessingShape" mc:Ignorable="w14 w15 w16se w16cid w16 w16cex w16sdtdh w16sdtfl w16du wp14">
+  <w:p>
+    <w:pPr>
+      <w:pStyle w:val="Footer"/>
+    </w:pPr>
+  </w:p>
+</w:ftr>
+</file>
+
 <file path=word/footnotes.xml><?xml version="1.0" encoding="utf-8"?>
 <w:footnotes xmlns:wpc="http://schemas.microsoft.com/office/word/2010/wordprocessingCanvas" xmlns:cx="http://schemas.microsoft.com/office/drawing/2014/chartex" xmlns:cx1="http://schemas.microsoft.com/office/drawing/2015/9/8/chartex" xmlns:cx2="http://schemas.microsoft.com/office/drawing/2015/10/21/chartex" xmlns:cx3="http://schemas.microsoft.com/office/drawing/2016/5/9/chartex" xmlns:cx4="http://schemas.microsoft.com/office/drawing/2016/5/10/chartex" xmlns:cx5="http://schemas.microsoft.com/office/drawing/2016/5/11/chartex" xmlns:cx6="http://schemas.microsoft.com/office/drawing/2016/5/12/chartex" xmlns:cx7="http://schemas.microsoft.com/office/drawing/2016/5/13/chartex" xmlns:cx8="http://schemas.microsoft.com/office/drawing/2016/5/14/chartex" xmlns:mc="http://schemas.openxmlformats.org/markup-compatibility/2006" xmlns:aink="http://schemas.microsoft.com/office/drawing/2016/ink" xmlns:am3d="http://schemas.microsoft.com/office/drawing/2017/model3d" xmlns:o="urn:schemas-microsoft-com:office:office" xmlns:oel="http://schemas.microsoft.com/office/2019/extlst" xmlns:r="http://schemas.openxmlformats.org/officeDocument/2006/relationships" xmlns:m="http://schemas.openxmlformats.org/officeDocument/2006/math" xmlns:v="urn:schemas-microsoft-com:vml" xmlns:wp14="http://schemas.microsoft.com/office/word/2010/wordprocessingDrawing" xmlns:wp="http://schemas.openxmlformats.org/drawingml/2006/wordprocessingDrawing" xmlns:w10="urn:schemas-microsoft-com:office:word" xmlns:w="http://schemas.openxmlformats.org/wordprocessingml/2006/main" xmlns:w14="http://schemas.microsoft.com/office/word/2010/wordml" xmlns:w15="http://schemas.microsoft.com/office/word/2012/wordml" xmlns:w16cex="http://schemas.microsoft.com/office/word/2018/wordml/cex" xmlns:w16cid="http://schemas.microsoft.com/office/word/2016/wordml/cid" xmlns:w16="http://schemas.microsoft.com/office/word/2018/wordml" xmlns:w16du="http://schemas.microsoft.com/office/word/2023/wordml/word16du" xmlns:w16sdtdh="http://schemas.microsoft.com/office/word/2020/wordml/sdtdatahash" xmlns:w16sdtfl="http://schemas.microsoft.com/office/word/2024/wordml/sdtformatlock" xmlns:w16se="http://schemas.microsoft.com/office/word/2015/wordml/symex" xmlns:wpg="http://schemas.microsoft.com/office/word/2010/wordprocessingGroup" xmlns:wpi="http://schemas.microsoft.com/office/word/2010/wordprocessingInk" xmlns:wne="http://schemas.microsoft.com/office/word/2006/wordml" xmlns:wps="http://schemas.microsoft.com/office/word/2010/wordprocessingShape" mc:Ignorable="w14 w15 w16se w16cid w16 w16cex w16sdtdh w16sdtfl w16du wp14">
   <w:footnote w:type="separator" w:id="-1">
@@ -8187,6 +8222,16 @@
 </file>
 
 <file path=word/header1.xml><?xml version="1.0" encoding="utf-8"?>
+<w:hdr xmlns:wpc="http://schemas.microsoft.com/office/word/2010/wordprocessingCanvas" xmlns:cx="http://schemas.microsoft.com/office/drawing/2014/chartex" xmlns:cx1="http://schemas.microsoft.com/office/drawing/2015/9/8/chartex" xmlns:cx2="http://schemas.microsoft.com/office/drawing/2015/10/21/chartex" xmlns:cx3="http://schemas.microsoft.com/office/drawing/2016/5/9/chartex" xmlns:cx4="http://schemas.microsoft.com/office/drawing/2016/5/10/chartex" xmlns:cx5="http://schemas.microsoft.com/office/drawing/2016/5/11/chartex" xmlns:cx6="http://schemas.microsoft.com/office/drawing/2016/5/12/chartex" xmlns:cx7="http://schemas.microsoft.com/office/drawing/2016/5/13/chartex" xmlns:cx8="http://schemas.microsoft.com/office/drawing/2016/5/14/chartex" xmlns:mc="http://schemas.openxmlformats.org/markup-compatibility/2006" xmlns:aink="http://schemas.microsoft.com/office/drawing/2016/ink" xmlns:am3d="http://schemas.microsoft.com/office/drawing/2017/model3d" xmlns:o="urn:schemas-microsoft-com:office:office" xmlns:oel="http://schemas.microsoft.com/office/2019/extlst" xmlns:r="http://schemas.openxmlformats.org/officeDocument/2006/relationships" xmlns:m="http://schemas.openxmlformats.org/officeDocument/2006/math" xmlns:v="urn:schemas-microsoft-com:vml" xmlns:wp14="http://schemas.microsoft.com/office/word/2010/wordprocessingDrawing" xmlns:wp="http://schemas.openxmlformats.org/drawingml/2006/wordprocessingDrawing" xmlns:w10="urn:schemas-microsoft-com:office:word" xmlns:w="http://schemas.openxmlformats.org/wordprocessingml/2006/main" xmlns:w14="http://schemas.microsoft.com/office/word/2010/wordml" xmlns:w15="http://schemas.microsoft.com/office/word/2012/wordml" xmlns:w16cex="http://schemas.microsoft.com/office/word/2018/wordml/cex" xmlns:w16cid="http://schemas.microsoft.com/office/word/2016/wordml/cid" xmlns:w16="http://schemas.microsoft.com/office/word/2018/wordml" xmlns:w16du="http://schemas.microsoft.com/office/word/2023/wordml/word16du" xmlns:w16sdtdh="http://schemas.microsoft.com/office/word/2020/wordml/sdtdatahash" xmlns:w16sdtfl="http://schemas.microsoft.com/office/word/2024/wordml/sdtformatlock" xmlns:w16se="http://schemas.microsoft.com/office/word/2015/wordml/symex" xmlns:wpg="http://schemas.microsoft.com/office/word/2010/wordprocessingGroup" xmlns:wpi="http://schemas.microsoft.com/office/word/2010/wordprocessingInk" xmlns:wne="http://schemas.microsoft.com/office/word/2006/wordml" xmlns:wps="http://schemas.microsoft.com/office/word/2010/wordprocessingShape" mc:Ignorable="w14 w15 w16se w16cid w16 w16cex w16sdtdh w16sdtfl w16du wp14">
+  <w:p>
+    <w:pPr>
+      <w:pStyle w:val="Header"/>
+    </w:pPr>
+  </w:p>
+</w:hdr>
+</file>
+
+<file path=word/header2.xml><?xml version="1.0" encoding="utf-8"?>
 <w:hdr xmlns:wpc="http://schemas.microsoft.com/office/word/2010/wordprocessingCanvas" xmlns:cx="http://schemas.microsoft.com/office/drawing/2014/chartex" xmlns:cx1="http://schemas.microsoft.com/office/drawing/2015/9/8/chartex" xmlns:cx2="http://schemas.microsoft.com/office/drawing/2015/10/21/chartex" xmlns:cx3="http://schemas.microsoft.com/office/drawing/2016/5/9/chartex" xmlns:cx4="http://schemas.microsoft.com/office/drawing/2016/5/10/chartex" xmlns:cx5="http://schemas.microsoft.com/office/drawing/2016/5/11/chartex" xmlns:cx6="http://schemas.microsoft.com/office/drawing/2016/5/12/chartex" xmlns:cx7="http://schemas.microsoft.com/office/drawing/2016/5/13/chartex" xmlns:cx8="http://schemas.microsoft.com/office/drawing/2016/5/14/chartex" xmlns:mc="http://schemas.openxmlformats.org/markup-compatibility/2006" xmlns:aink="http://schemas.microsoft.com/office/drawing/2016/ink" xmlns:am3d="http://schemas.microsoft.com/office/drawing/2017/model3d" xmlns:o="urn:schemas-microsoft-com:office:office" xmlns:oel="http://schemas.microsoft.com/office/2019/extlst" xmlns:r="http://schemas.openxmlformats.org/officeDocument/2006/relationships" xmlns:m="http://schemas.openxmlformats.org/officeDocument/2006/math" xmlns:v="urn:schemas-microsoft-com:vml" xmlns:wp14="http://schemas.microsoft.com/office/word/2010/wordprocessingDrawing" xmlns:wp="http://schemas.openxmlformats.org/drawingml/2006/wordprocessingDrawing" xmlns:w10="urn:schemas-microsoft-com:office:word" xmlns:w="http://schemas.openxmlformats.org/wordprocessingml/2006/main" xmlns:w14="http://schemas.microsoft.com/office/word/2010/wordml" xmlns:w15="http://schemas.microsoft.com/office/word/2012/wordml" xmlns:w16cex="http://schemas.microsoft.com/office/word/2018/wordml/cex" xmlns:w16cid="http://schemas.microsoft.com/office/word/2016/wordml/cid" xmlns:w16="http://schemas.microsoft.com/office/word/2018/wordml" xmlns:w16du="http://schemas.microsoft.com/office/word/2023/wordml/word16du" xmlns:w16sdtdh="http://schemas.microsoft.com/office/word/2020/wordml/sdtdatahash" xmlns:w16sdtfl="http://schemas.microsoft.com/office/word/2024/wordml/sdtformatlock" xmlns:w16se="http://schemas.microsoft.com/office/word/2015/wordml/symex" xmlns:wpg="http://schemas.microsoft.com/office/word/2010/wordprocessingGroup" xmlns:wpi="http://schemas.microsoft.com/office/word/2010/wordprocessingInk" xmlns:wne="http://schemas.microsoft.com/office/word/2006/wordml" xmlns:wps="http://schemas.microsoft.com/office/word/2010/wordprocessingShape" mc:Ignorable="w14 w15 w16se w16cid w16 w16cex w16sdtdh w16sdtfl w16du wp14">
   <w:p>
     <w:pPr>
@@ -8371,6 +8416,13 @@
         <w:sz w:val="16"/>
         <w:szCs w:val="16"/>
       </w:rPr>
+      <w:t>J</w:t>
+    </w:r>
+    <w:r>
+      <w:rPr>
+        <w:sz w:val="16"/>
+        <w:szCs w:val="16"/>
+      </w:rPr>
       <w:t xml:space="preserve">l. Ir. Soekarno, </w:t>
     </w:r>
     <w:proofErr w:type="spellStart"/>
@@ -8422,6 +8474,16 @@
       </w:rPr>
       <w:t xml:space="preserve">Website: www.sugenghartono.ac.id | Email: ush@sugenghartono.ac.id </w:t>
     </w:r>
+  </w:p>
+</w:hdr>
+</file>
+
+<file path=word/header3.xml><?xml version="1.0" encoding="utf-8"?>
+<w:hdr xmlns:wpc="http://schemas.microsoft.com/office/word/2010/wordprocessingCanvas" xmlns:cx="http://schemas.microsoft.com/office/drawing/2014/chartex" xmlns:cx1="http://schemas.microsoft.com/office/drawing/2015/9/8/chartex" xmlns:cx2="http://schemas.microsoft.com/office/drawing/2015/10/21/chartex" xmlns:cx3="http://schemas.microsoft.com/office/drawing/2016/5/9/chartex" xmlns:cx4="http://schemas.microsoft.com/office/drawing/2016/5/10/chartex" xmlns:cx5="http://schemas.microsoft.com/office/drawing/2016/5/11/chartex" xmlns:cx6="http://schemas.microsoft.com/office/drawing/2016/5/12/chartex" xmlns:cx7="http://schemas.microsoft.com/office/drawing/2016/5/13/chartex" xmlns:cx8="http://schemas.microsoft.com/office/drawing/2016/5/14/chartex" xmlns:mc="http://schemas.openxmlformats.org/markup-compatibility/2006" xmlns:aink="http://schemas.microsoft.com/office/drawing/2016/ink" xmlns:am3d="http://schemas.microsoft.com/office/drawing/2017/model3d" xmlns:o="urn:schemas-microsoft-com:office:office" xmlns:oel="http://schemas.microsoft.com/office/2019/extlst" xmlns:r="http://schemas.openxmlformats.org/officeDocument/2006/relationships" xmlns:m="http://schemas.openxmlformats.org/officeDocument/2006/math" xmlns:v="urn:schemas-microsoft-com:vml" xmlns:wp14="http://schemas.microsoft.com/office/word/2010/wordprocessingDrawing" xmlns:wp="http://schemas.openxmlformats.org/drawingml/2006/wordprocessingDrawing" xmlns:w10="urn:schemas-microsoft-com:office:word" xmlns:w="http://schemas.openxmlformats.org/wordprocessingml/2006/main" xmlns:w14="http://schemas.microsoft.com/office/word/2010/wordml" xmlns:w15="http://schemas.microsoft.com/office/word/2012/wordml" xmlns:w16cex="http://schemas.microsoft.com/office/word/2018/wordml/cex" xmlns:w16cid="http://schemas.microsoft.com/office/word/2016/wordml/cid" xmlns:w16="http://schemas.microsoft.com/office/word/2018/wordml" xmlns:w16du="http://schemas.microsoft.com/office/word/2023/wordml/word16du" xmlns:w16sdtdh="http://schemas.microsoft.com/office/word/2020/wordml/sdtdatahash" xmlns:w16sdtfl="http://schemas.microsoft.com/office/word/2024/wordml/sdtformatlock" xmlns:w16se="http://schemas.microsoft.com/office/word/2015/wordml/symex" xmlns:wpg="http://schemas.microsoft.com/office/word/2010/wordprocessingGroup" xmlns:wpi="http://schemas.microsoft.com/office/word/2010/wordprocessingInk" xmlns:wne="http://schemas.microsoft.com/office/word/2006/wordml" xmlns:wps="http://schemas.microsoft.com/office/word/2010/wordprocessingShape" mc:Ignorable="w14 w15 w16se w16cid w16 w16cex w16sdtdh w16sdtfl w16du wp14">
+  <w:p>
+    <w:pPr>
+      <w:pStyle w:val="Header"/>
+    </w:pPr>
   </w:p>
 </w:hdr>
 </file>
@@ -10986,6 +11048,7 @@
   <w:style w:type="character" w:default="1" w:styleId="DefaultParagraphFont">
     <w:name w:val="Default Paragraph Font"/>
     <w:uiPriority w:val="1"/>
+    <w:semiHidden/>
     <w:unhideWhenUsed/>
   </w:style>
   <w:style w:type="table" w:default="1" w:styleId="TableNormal">

</xml_diff>

<commit_message>
chore: replace SKPI template with updated ver.2003 version
</commit_message>
<xml_diff>
--- a/public/FIXED TEMPLATE SKPI USH ver.2003.docx
+++ b/public/FIXED TEMPLATE SKPI USH ver.2003.docx
@@ -8315,31 +8315,17 @@
         <w:szCs w:val="36"/>
       </w:rPr>
       <w:drawing>
-        <wp:anchor distT="0" distB="0" distL="114300" distR="114300" simplePos="0" relativeHeight="251657216" behindDoc="1" locked="0" layoutInCell="1" allowOverlap="1" wp14:anchorId="5D81A678" wp14:editId="4ABD0D71">
+        <wp:anchor distT="0" distB="0" distL="114300" distR="114300" simplePos="0" relativeHeight="251657216" behindDoc="0" locked="0" layoutInCell="1" allowOverlap="1" wp14:anchorId="5D81A678" wp14:editId="70AC9694">
           <wp:simplePos x="0" y="0"/>
           <wp:positionH relativeFrom="column">
-            <wp:posOffset>-9525</wp:posOffset>
+            <wp:posOffset>-11430</wp:posOffset>
           </wp:positionH>
           <wp:positionV relativeFrom="paragraph">
-            <wp:posOffset>-52070</wp:posOffset>
+            <wp:posOffset>-50165</wp:posOffset>
           </wp:positionV>
           <wp:extent cx="647700" cy="647700"/>
           <wp:effectExtent l="0" t="0" r="0" b="0"/>
-          <wp:wrapTight wrapText="bothSides">
-            <wp:wrapPolygon edited="0">
-              <wp:start x="5718" y="0"/>
-              <wp:lineTo x="0" y="3812"/>
-              <wp:lineTo x="0" y="15882"/>
-              <wp:lineTo x="4447" y="20329"/>
-              <wp:lineTo x="5718" y="20965"/>
-              <wp:lineTo x="15247" y="20965"/>
-              <wp:lineTo x="16518" y="20329"/>
-              <wp:lineTo x="20965" y="15882"/>
-              <wp:lineTo x="20965" y="3812"/>
-              <wp:lineTo x="15247" y="0"/>
-              <wp:lineTo x="5718" y="0"/>
-            </wp:wrapPolygon>
-          </wp:wrapTight>
+          <wp:wrapNone/>
           <wp:docPr id="1" name="Picture 3"/>
           <wp:cNvGraphicFramePr>
             <a:graphicFrameLocks xmlns:a="http://schemas.openxmlformats.org/drawingml/2006/main" noChangeAspect="1"/>

</xml_diff>

<commit_message>
feat: tambahkan fitur edit & pelengkap data sertifikat/prestasi SKPI oleh Admin
</commit_message>
<xml_diff>
--- a/public/FIXED TEMPLATE SKPI USH ver.2003.docx
+++ b/public/FIXED TEMPLATE SKPI USH ver.2003.docx
@@ -5608,7 +5608,6 @@
               </w:rPr>
             </w:pPr>
             <w:r>
-              <w:lastRenderedPageBreak/>
               <w:br w:type="page"/>
             </w:r>
             <w:r>
@@ -5862,7 +5861,21 @@
               <w:rPr>
                 <w:rFonts w:eastAsia="Quattrocento Sans"/>
               </w:rPr>
-              <w:t xml:space="preserve">SKPI hanya </w:t>
+              <w:t xml:space="preserve">SKPI </w:t>
+            </w:r>
+            <w:proofErr w:type="spellStart"/>
+            <w:r>
+              <w:rPr>
+                <w:rFonts w:eastAsia="Quattrocento Sans"/>
+              </w:rPr>
+              <w:t>hanya</w:t>
+            </w:r>
+            <w:proofErr w:type="spellEnd"/>
+            <w:r>
+              <w:rPr>
+                <w:rFonts w:eastAsia="Quattrocento Sans"/>
+              </w:rPr>
+              <w:t xml:space="preserve"> </w:t>
             </w:r>
             <w:proofErr w:type="spellStart"/>
             <w:r>
@@ -8495,12 +8508,7 @@
       </w:pPr>
     </w:p>
     <w:sectPr>
-      <w:headerReference w:type="even" r:id="rId9"/>
-      <w:headerReference w:type="default" r:id="rId10"/>
-      <w:footerReference w:type="even" r:id="rId11"/>
-      <w:footerReference w:type="default" r:id="rId12"/>
-      <w:headerReference w:type="first" r:id="rId13"/>
-      <w:footerReference w:type="first" r:id="rId14"/>
+      <w:headerReference w:type="default" r:id="rId9"/>
       <w:pgSz w:w="12242" w:h="18711" w:code="5"/>
       <w:pgMar w:top="1440" w:right="1440" w:bottom="1440" w:left="1440" w:header="397" w:footer="709" w:gutter="0"/>
       <w:cols w:space="708"/>
@@ -8529,36 +8537,6 @@
 </w:endnotes>
 </file>
 
-<file path=word/footer1.xml><?xml version="1.0" encoding="utf-8"?>
-<w:ftr xmlns:wpc="http://schemas.microsoft.com/office/word/2010/wordprocessingCanvas" xmlns:cx="http://schemas.microsoft.com/office/drawing/2014/chartex" xmlns:cx1="http://schemas.microsoft.com/office/drawing/2015/9/8/chartex" xmlns:cx2="http://schemas.microsoft.com/office/drawing/2015/10/21/chartex" xmlns:cx3="http://schemas.microsoft.com/office/drawing/2016/5/9/chartex" xmlns:cx4="http://schemas.microsoft.com/office/drawing/2016/5/10/chartex" xmlns:cx5="http://schemas.microsoft.com/office/drawing/2016/5/11/chartex" xmlns:cx6="http://schemas.microsoft.com/office/drawing/2016/5/12/chartex" xmlns:cx7="http://schemas.microsoft.com/office/drawing/2016/5/13/chartex" xmlns:cx8="http://schemas.microsoft.com/office/drawing/2016/5/14/chartex" xmlns:mc="http://schemas.openxmlformats.org/markup-compatibility/2006" xmlns:aink="http://schemas.microsoft.com/office/drawing/2016/ink" xmlns:am3d="http://schemas.microsoft.com/office/drawing/2017/model3d" xmlns:o="urn:schemas-microsoft-com:office:office" xmlns:oel="http://schemas.microsoft.com/office/2019/extlst" xmlns:r="http://schemas.openxmlformats.org/officeDocument/2006/relationships" xmlns:m="http://schemas.openxmlformats.org/officeDocument/2006/math" xmlns:v="urn:schemas-microsoft-com:vml" xmlns:wp14="http://schemas.microsoft.com/office/word/2010/wordprocessingDrawing" xmlns:wp="http://schemas.openxmlformats.org/drawingml/2006/wordprocessingDrawing" xmlns:w10="urn:schemas-microsoft-com:office:word" xmlns:w="http://schemas.openxmlformats.org/wordprocessingml/2006/main" xmlns:w14="http://schemas.microsoft.com/office/word/2010/wordml" xmlns:w15="http://schemas.microsoft.com/office/word/2012/wordml" xmlns:w16cex="http://schemas.microsoft.com/office/word/2018/wordml/cex" xmlns:w16cid="http://schemas.microsoft.com/office/word/2016/wordml/cid" xmlns:w16="http://schemas.microsoft.com/office/word/2018/wordml" xmlns:w16sdtdh="http://schemas.microsoft.com/office/word/2020/wordml/sdtdatahash" xmlns:w16se="http://schemas.microsoft.com/office/word/2015/wordml/symex" xmlns:wpg="http://schemas.microsoft.com/office/word/2010/wordprocessingGroup" xmlns:wpi="http://schemas.microsoft.com/office/word/2010/wordprocessingInk" xmlns:wne="http://schemas.microsoft.com/office/word/2006/wordml" xmlns:wps="http://schemas.microsoft.com/office/word/2010/wordprocessingShape" mc:Ignorable="w14 w15 w16se w16cid w16 w16cex w16sdtdh wp14">
-  <w:p>
-    <w:pPr>
-      <w:pStyle w:val="Footer"/>
-    </w:pPr>
-  </w:p>
-</w:ftr>
-</file>
-
-<file path=word/footer2.xml><?xml version="1.0" encoding="utf-8"?>
-<w:ftr xmlns:wpc="http://schemas.microsoft.com/office/word/2010/wordprocessingCanvas" xmlns:cx="http://schemas.microsoft.com/office/drawing/2014/chartex" xmlns:cx1="http://schemas.microsoft.com/office/drawing/2015/9/8/chartex" xmlns:cx2="http://schemas.microsoft.com/office/drawing/2015/10/21/chartex" xmlns:cx3="http://schemas.microsoft.com/office/drawing/2016/5/9/chartex" xmlns:cx4="http://schemas.microsoft.com/office/drawing/2016/5/10/chartex" xmlns:cx5="http://schemas.microsoft.com/office/drawing/2016/5/11/chartex" xmlns:cx6="http://schemas.microsoft.com/office/drawing/2016/5/12/chartex" xmlns:cx7="http://schemas.microsoft.com/office/drawing/2016/5/13/chartex" xmlns:cx8="http://schemas.microsoft.com/office/drawing/2016/5/14/chartex" xmlns:mc="http://schemas.openxmlformats.org/markup-compatibility/2006" xmlns:aink="http://schemas.microsoft.com/office/drawing/2016/ink" xmlns:am3d="http://schemas.microsoft.com/office/drawing/2017/model3d" xmlns:o="urn:schemas-microsoft-com:office:office" xmlns:oel="http://schemas.microsoft.com/office/2019/extlst" xmlns:r="http://schemas.openxmlformats.org/officeDocument/2006/relationships" xmlns:m="http://schemas.openxmlformats.org/officeDocument/2006/math" xmlns:v="urn:schemas-microsoft-com:vml" xmlns:wp14="http://schemas.microsoft.com/office/word/2010/wordprocessingDrawing" xmlns:wp="http://schemas.openxmlformats.org/drawingml/2006/wordprocessingDrawing" xmlns:w10="urn:schemas-microsoft-com:office:word" xmlns:w="http://schemas.openxmlformats.org/wordprocessingml/2006/main" xmlns:w14="http://schemas.microsoft.com/office/word/2010/wordml" xmlns:w15="http://schemas.microsoft.com/office/word/2012/wordml" xmlns:w16cex="http://schemas.microsoft.com/office/word/2018/wordml/cex" xmlns:w16cid="http://schemas.microsoft.com/office/word/2016/wordml/cid" xmlns:w16="http://schemas.microsoft.com/office/word/2018/wordml" xmlns:w16sdtdh="http://schemas.microsoft.com/office/word/2020/wordml/sdtdatahash" xmlns:w16se="http://schemas.microsoft.com/office/word/2015/wordml/symex" xmlns:wpg="http://schemas.microsoft.com/office/word/2010/wordprocessingGroup" xmlns:wpi="http://schemas.microsoft.com/office/word/2010/wordprocessingInk" xmlns:wne="http://schemas.microsoft.com/office/word/2006/wordml" xmlns:wps="http://schemas.microsoft.com/office/word/2010/wordprocessingShape" mc:Ignorable="w14 w15 w16se w16cid w16 w16cex w16sdtdh wp14">
-  <w:p>
-    <w:pPr>
-      <w:pStyle w:val="Footer"/>
-    </w:pPr>
-  </w:p>
-</w:ftr>
-</file>
-
-<file path=word/footer3.xml><?xml version="1.0" encoding="utf-8"?>
-<w:ftr xmlns:wpc="http://schemas.microsoft.com/office/word/2010/wordprocessingCanvas" xmlns:cx="http://schemas.microsoft.com/office/drawing/2014/chartex" xmlns:cx1="http://schemas.microsoft.com/office/drawing/2015/9/8/chartex" xmlns:cx2="http://schemas.microsoft.com/office/drawing/2015/10/21/chartex" xmlns:cx3="http://schemas.microsoft.com/office/drawing/2016/5/9/chartex" xmlns:cx4="http://schemas.microsoft.com/office/drawing/2016/5/10/chartex" xmlns:cx5="http://schemas.microsoft.com/office/drawing/2016/5/11/chartex" xmlns:cx6="http://schemas.microsoft.com/office/drawing/2016/5/12/chartex" xmlns:cx7="http://schemas.microsoft.com/office/drawing/2016/5/13/chartex" xmlns:cx8="http://schemas.microsoft.com/office/drawing/2016/5/14/chartex" xmlns:mc="http://schemas.openxmlformats.org/markup-compatibility/2006" xmlns:aink="http://schemas.microsoft.com/office/drawing/2016/ink" xmlns:am3d="http://schemas.microsoft.com/office/drawing/2017/model3d" xmlns:o="urn:schemas-microsoft-com:office:office" xmlns:oel="http://schemas.microsoft.com/office/2019/extlst" xmlns:r="http://schemas.openxmlformats.org/officeDocument/2006/relationships" xmlns:m="http://schemas.openxmlformats.org/officeDocument/2006/math" xmlns:v="urn:schemas-microsoft-com:vml" xmlns:wp14="http://schemas.microsoft.com/office/word/2010/wordprocessingDrawing" xmlns:wp="http://schemas.openxmlformats.org/drawingml/2006/wordprocessingDrawing" xmlns:w10="urn:schemas-microsoft-com:office:word" xmlns:w="http://schemas.openxmlformats.org/wordprocessingml/2006/main" xmlns:w14="http://schemas.microsoft.com/office/word/2010/wordml" xmlns:w15="http://schemas.microsoft.com/office/word/2012/wordml" xmlns:w16cex="http://schemas.microsoft.com/office/word/2018/wordml/cex" xmlns:w16cid="http://schemas.microsoft.com/office/word/2016/wordml/cid" xmlns:w16="http://schemas.microsoft.com/office/word/2018/wordml" xmlns:w16sdtdh="http://schemas.microsoft.com/office/word/2020/wordml/sdtdatahash" xmlns:w16se="http://schemas.microsoft.com/office/word/2015/wordml/symex" xmlns:wpg="http://schemas.microsoft.com/office/word/2010/wordprocessingGroup" xmlns:wpi="http://schemas.microsoft.com/office/word/2010/wordprocessingInk" xmlns:wne="http://schemas.microsoft.com/office/word/2006/wordml" xmlns:wps="http://schemas.microsoft.com/office/word/2010/wordprocessingShape" mc:Ignorable="w14 w15 w16se w16cid w16 w16cex w16sdtdh wp14">
-  <w:p>
-    <w:pPr>
-      <w:pStyle w:val="Footer"/>
-    </w:pPr>
-  </w:p>
-</w:ftr>
-</file>
-
 <file path=word/footnotes.xml><?xml version="1.0" encoding="utf-8"?>
 <w:footnotes xmlns:wpc="http://schemas.microsoft.com/office/word/2010/wordprocessingCanvas" xmlns:cx="http://schemas.microsoft.com/office/drawing/2014/chartex" xmlns:cx1="http://schemas.microsoft.com/office/drawing/2015/9/8/chartex" xmlns:cx2="http://schemas.microsoft.com/office/drawing/2015/10/21/chartex" xmlns:cx3="http://schemas.microsoft.com/office/drawing/2016/5/9/chartex" xmlns:cx4="http://schemas.microsoft.com/office/drawing/2016/5/10/chartex" xmlns:cx5="http://schemas.microsoft.com/office/drawing/2016/5/11/chartex" xmlns:cx6="http://schemas.microsoft.com/office/drawing/2016/5/12/chartex" xmlns:cx7="http://schemas.microsoft.com/office/drawing/2016/5/13/chartex" xmlns:cx8="http://schemas.microsoft.com/office/drawing/2016/5/14/chartex" xmlns:mc="http://schemas.openxmlformats.org/markup-compatibility/2006" xmlns:aink="http://schemas.microsoft.com/office/drawing/2016/ink" xmlns:am3d="http://schemas.microsoft.com/office/drawing/2017/model3d" xmlns:o="urn:schemas-microsoft-com:office:office" xmlns:oel="http://schemas.microsoft.com/office/2019/extlst" xmlns:r="http://schemas.openxmlformats.org/officeDocument/2006/relationships" xmlns:m="http://schemas.openxmlformats.org/officeDocument/2006/math" xmlns:v="urn:schemas-microsoft-com:vml" xmlns:wp14="http://schemas.microsoft.com/office/word/2010/wordprocessingDrawing" xmlns:wp="http://schemas.openxmlformats.org/drawingml/2006/wordprocessingDrawing" xmlns:w10="urn:schemas-microsoft-com:office:word" xmlns:w="http://schemas.openxmlformats.org/wordprocessingml/2006/main" xmlns:w14="http://schemas.microsoft.com/office/word/2010/wordml" xmlns:w15="http://schemas.microsoft.com/office/word/2012/wordml" xmlns:w16cex="http://schemas.microsoft.com/office/word/2018/wordml/cex" xmlns:w16cid="http://schemas.microsoft.com/office/word/2016/wordml/cid" xmlns:w16="http://schemas.microsoft.com/office/word/2018/wordml" xmlns:w16sdtdh="http://schemas.microsoft.com/office/word/2020/wordml/sdtdatahash" xmlns:w16se="http://schemas.microsoft.com/office/word/2015/wordml/symex" xmlns:wpg="http://schemas.microsoft.com/office/word/2010/wordprocessingGroup" xmlns:wpi="http://schemas.microsoft.com/office/word/2010/wordprocessingInk" xmlns:wne="http://schemas.microsoft.com/office/word/2006/wordml" xmlns:wps="http://schemas.microsoft.com/office/word/2010/wordprocessingShape" mc:Ignorable="w14 w15 w16se w16cid w16 w16cex w16sdtdh wp14">
   <w:footnote w:type="separator" w:id="-1">
@@ -8582,26 +8560,11 @@
 <w:hdr xmlns:wpc="http://schemas.microsoft.com/office/word/2010/wordprocessingCanvas" xmlns:cx="http://schemas.microsoft.com/office/drawing/2014/chartex" xmlns:cx1="http://schemas.microsoft.com/office/drawing/2015/9/8/chartex" xmlns:cx2="http://schemas.microsoft.com/office/drawing/2015/10/21/chartex" xmlns:cx3="http://schemas.microsoft.com/office/drawing/2016/5/9/chartex" xmlns:cx4="http://schemas.microsoft.com/office/drawing/2016/5/10/chartex" xmlns:cx5="http://schemas.microsoft.com/office/drawing/2016/5/11/chartex" xmlns:cx6="http://schemas.microsoft.com/office/drawing/2016/5/12/chartex" xmlns:cx7="http://schemas.microsoft.com/office/drawing/2016/5/13/chartex" xmlns:cx8="http://schemas.microsoft.com/office/drawing/2016/5/14/chartex" xmlns:mc="http://schemas.openxmlformats.org/markup-compatibility/2006" xmlns:aink="http://schemas.microsoft.com/office/drawing/2016/ink" xmlns:am3d="http://schemas.microsoft.com/office/drawing/2017/model3d" xmlns:o="urn:schemas-microsoft-com:office:office" xmlns:oel="http://schemas.microsoft.com/office/2019/extlst" xmlns:r="http://schemas.openxmlformats.org/officeDocument/2006/relationships" xmlns:m="http://schemas.openxmlformats.org/officeDocument/2006/math" xmlns:v="urn:schemas-microsoft-com:vml" xmlns:wp14="http://schemas.microsoft.com/office/word/2010/wordprocessingDrawing" xmlns:wp="http://schemas.openxmlformats.org/drawingml/2006/wordprocessingDrawing" xmlns:w10="urn:schemas-microsoft-com:office:word" xmlns:w="http://schemas.openxmlformats.org/wordprocessingml/2006/main" xmlns:w14="http://schemas.microsoft.com/office/word/2010/wordml" xmlns:w15="http://schemas.microsoft.com/office/word/2012/wordml" xmlns:w16cex="http://schemas.microsoft.com/office/word/2018/wordml/cex" xmlns:w16cid="http://schemas.microsoft.com/office/word/2016/wordml/cid" xmlns:w16="http://schemas.microsoft.com/office/word/2018/wordml" xmlns:w16sdtdh="http://schemas.microsoft.com/office/word/2020/wordml/sdtdatahash" xmlns:w16se="http://schemas.microsoft.com/office/word/2015/wordml/symex" xmlns:wpg="http://schemas.microsoft.com/office/word/2010/wordprocessingGroup" xmlns:wpi="http://schemas.microsoft.com/office/word/2010/wordprocessingInk" xmlns:wne="http://schemas.microsoft.com/office/word/2006/wordml" xmlns:wps="http://schemas.microsoft.com/office/word/2010/wordprocessingShape" mc:Ignorable="w14 w15 w16se w16cid w16 w16cex w16sdtdh wp14">
   <w:p>
     <w:pPr>
-      <w:pStyle w:val="Header"/>
-    </w:pPr>
-  </w:p>
-</w:hdr>
-</file>
-
-<file path=word/header2.xml><?xml version="1.0" encoding="utf-8"?>
-<w:hdr xmlns:wpc="http://schemas.microsoft.com/office/word/2010/wordprocessingCanvas" xmlns:cx="http://schemas.microsoft.com/office/drawing/2014/chartex" xmlns:cx1="http://schemas.microsoft.com/office/drawing/2015/9/8/chartex" xmlns:cx2="http://schemas.microsoft.com/office/drawing/2015/10/21/chartex" xmlns:cx3="http://schemas.microsoft.com/office/drawing/2016/5/9/chartex" xmlns:cx4="http://schemas.microsoft.com/office/drawing/2016/5/10/chartex" xmlns:cx5="http://schemas.microsoft.com/office/drawing/2016/5/11/chartex" xmlns:cx6="http://schemas.microsoft.com/office/drawing/2016/5/12/chartex" xmlns:cx7="http://schemas.microsoft.com/office/drawing/2016/5/13/chartex" xmlns:cx8="http://schemas.microsoft.com/office/drawing/2016/5/14/chartex" xmlns:mc="http://schemas.openxmlformats.org/markup-compatibility/2006" xmlns:aink="http://schemas.microsoft.com/office/drawing/2016/ink" xmlns:am3d="http://schemas.microsoft.com/office/drawing/2017/model3d" xmlns:o="urn:schemas-microsoft-com:office:office" xmlns:oel="http://schemas.microsoft.com/office/2019/extlst" xmlns:r="http://schemas.openxmlformats.org/officeDocument/2006/relationships" xmlns:m="http://schemas.openxmlformats.org/officeDocument/2006/math" xmlns:v="urn:schemas-microsoft-com:vml" xmlns:wp14="http://schemas.microsoft.com/office/word/2010/wordprocessingDrawing" xmlns:wp="http://schemas.openxmlformats.org/drawingml/2006/wordprocessingDrawing" xmlns:w10="urn:schemas-microsoft-com:office:word" xmlns:w="http://schemas.openxmlformats.org/wordprocessingml/2006/main" xmlns:w14="http://schemas.microsoft.com/office/word/2010/wordml" xmlns:w15="http://schemas.microsoft.com/office/word/2012/wordml" xmlns:w16cex="http://schemas.microsoft.com/office/word/2018/wordml/cex" xmlns:w16cid="http://schemas.microsoft.com/office/word/2016/wordml/cid" xmlns:w16="http://schemas.microsoft.com/office/word/2018/wordml" xmlns:w16sdtdh="http://schemas.microsoft.com/office/word/2020/wordml/sdtdatahash" xmlns:w16se="http://schemas.microsoft.com/office/word/2015/wordml/symex" xmlns:wpg="http://schemas.microsoft.com/office/word/2010/wordprocessingGroup" xmlns:wpi="http://schemas.microsoft.com/office/word/2010/wordprocessingInk" xmlns:wne="http://schemas.microsoft.com/office/word/2006/wordml" xmlns:wps="http://schemas.microsoft.com/office/word/2010/wordprocessingShape" mc:Ignorable="w14 w15 w16se w16cid w16 w16cex w16sdtdh wp14">
-  <w:p>
-    <w:pPr>
-      <w:pBdr>
-        <w:bottom w:val="single" w:sz="24" w:space="8" w:color="000000"/>
-      </w:pBdr>
-      <w:ind w:left="-720" w:right="-720"/>
+      <w:ind w:right="4"/>
       <w:jc w:val="center"/>
       <w:rPr>
-        <w:b/>
-        <w:bCs/>
-        <w:sz w:val="36"/>
-        <w:szCs w:val="36"/>
+        <w:sz w:val="16"/>
+        <w:szCs w:val="16"/>
       </w:rPr>
     </w:pPr>
     <w:r>
@@ -8613,16 +8576,16 @@
         <w:szCs w:val="36"/>
       </w:rPr>
       <w:drawing>
-        <wp:anchor distT="0" distB="0" distL="114300" distR="114300" simplePos="0" relativeHeight="251659264" behindDoc="1" locked="0" layoutInCell="1" allowOverlap="1" wp14:anchorId="6FA86C1C" wp14:editId="234AEE24">
+        <wp:anchor distT="0" distB="0" distL="114300" distR="114300" simplePos="0" relativeHeight="251659264" behindDoc="1" locked="0" layoutInCell="1" allowOverlap="1" wp14:anchorId="6FA86C1C" wp14:editId="01D16C82">
           <wp:simplePos x="0" y="0"/>
-          <wp:positionH relativeFrom="column">
-            <wp:posOffset>-914213</wp:posOffset>
+          <wp:positionH relativeFrom="page">
+            <wp:align>left</wp:align>
           </wp:positionH>
           <wp:positionV relativeFrom="paragraph">
-            <wp:posOffset>-213995</wp:posOffset>
+            <wp:posOffset>-442595</wp:posOffset>
           </wp:positionV>
-          <wp:extent cx="7743825" cy="11886217"/>
-          <wp:effectExtent l="0" t="0" r="0" b="1270"/>
+          <wp:extent cx="7742774" cy="12246610"/>
+          <wp:effectExtent l="0" t="0" r="0" b="2540"/>
           <wp:wrapNone/>
           <wp:docPr id="1046271608" name="Picture 2"/>
           <wp:cNvGraphicFramePr>
@@ -8650,7 +8613,7 @@
                 <pic:spPr>
                   <a:xfrm>
                     <a:off x="0" y="0"/>
-                    <a:ext cx="7743825" cy="11886217"/>
+                    <a:ext cx="7742774" cy="12246610"/>
                   </a:xfrm>
                   <a:prstGeom prst="rect">
                     <a:avLst/>
@@ -8675,7 +8638,7 @@
         <w:szCs w:val="36"/>
       </w:rPr>
       <w:drawing>
-        <wp:anchor distT="0" distB="0" distL="114300" distR="114300" simplePos="0" relativeHeight="251657216" behindDoc="0" locked="0" layoutInCell="1" allowOverlap="1" wp14:anchorId="5D81A678" wp14:editId="70AC9694">
+        <wp:anchor distT="0" distB="0" distL="114300" distR="114300" simplePos="0" relativeHeight="251657216" behindDoc="0" locked="0" layoutInCell="1" allowOverlap="1" wp14:anchorId="5D81A678" wp14:editId="37E7ABE9">
           <wp:simplePos x="0" y="0"/>
           <wp:positionH relativeFrom="column">
             <wp:posOffset>-11430</wp:posOffset>
@@ -8747,16 +8710,16 @@
       </w:rPr>
       <w:t>UNIVERSITAS SUGENG HARTONO</w:t>
     </w:r>
-  </w:p>
-  <w:p>
-    <w:pPr>
-      <w:ind w:right="4"/>
-      <w:jc w:val="center"/>
+    <w:r>
       <w:rPr>
-        <w:sz w:val="16"/>
-        <w:szCs w:val="16"/>
+        <w:b/>
+        <w:bCs/>
+        <w:noProof/>
+        <w:sz w:val="36"/>
+        <w:szCs w:val="36"/>
       </w:rPr>
-    </w:pPr>
+      <w:br/>
+    </w:r>
     <w:r>
       <w:rPr>
         <w:sz w:val="16"/>
@@ -8818,18 +8781,130 @@
         <w:sz w:val="16"/>
         <w:szCs w:val="16"/>
       </w:rPr>
-      <w:t xml:space="preserve">Website: www.sugenghartono.ac.id | Email: ush@sugenghartono.ac.id </w:t>
+      <w:t xml:space="preserve">Website: www.sugenghartono.ac.id | Email: </w:t>
+    </w:r>
+    <w:hyperlink r:id="rId3" w:history="1">
+      <w:r>
+        <w:rPr>
+          <w:rStyle w:val="Hyperlink"/>
+          <w:sz w:val="16"/>
+          <w:szCs w:val="16"/>
+        </w:rPr>
+        <w:t>ush@sugenghartono.ac.id</w:t>
+      </w:r>
+    </w:hyperlink>
+    <w:r>
+      <w:rPr>
+        <w:sz w:val="16"/>
+        <w:szCs w:val="16"/>
+      </w:rPr>
+      <w:t xml:space="preserve"> </w:t>
     </w:r>
   </w:p>
-</w:hdr>
-</file>
-
-<file path=word/header3.xml><?xml version="1.0" encoding="utf-8"?>
-<w:hdr xmlns:wpc="http://schemas.microsoft.com/office/word/2010/wordprocessingCanvas" xmlns:cx="http://schemas.microsoft.com/office/drawing/2014/chartex" xmlns:cx1="http://schemas.microsoft.com/office/drawing/2015/9/8/chartex" xmlns:cx2="http://schemas.microsoft.com/office/drawing/2015/10/21/chartex" xmlns:cx3="http://schemas.microsoft.com/office/drawing/2016/5/9/chartex" xmlns:cx4="http://schemas.microsoft.com/office/drawing/2016/5/10/chartex" xmlns:cx5="http://schemas.microsoft.com/office/drawing/2016/5/11/chartex" xmlns:cx6="http://schemas.microsoft.com/office/drawing/2016/5/12/chartex" xmlns:cx7="http://schemas.microsoft.com/office/drawing/2016/5/13/chartex" xmlns:cx8="http://schemas.microsoft.com/office/drawing/2016/5/14/chartex" xmlns:mc="http://schemas.openxmlformats.org/markup-compatibility/2006" xmlns:aink="http://schemas.microsoft.com/office/drawing/2016/ink" xmlns:am3d="http://schemas.microsoft.com/office/drawing/2017/model3d" xmlns:o="urn:schemas-microsoft-com:office:office" xmlns:oel="http://schemas.microsoft.com/office/2019/extlst" xmlns:r="http://schemas.openxmlformats.org/officeDocument/2006/relationships" xmlns:m="http://schemas.openxmlformats.org/officeDocument/2006/math" xmlns:v="urn:schemas-microsoft-com:vml" xmlns:wp14="http://schemas.microsoft.com/office/word/2010/wordprocessingDrawing" xmlns:wp="http://schemas.openxmlformats.org/drawingml/2006/wordprocessingDrawing" xmlns:w10="urn:schemas-microsoft-com:office:word" xmlns:w="http://schemas.openxmlformats.org/wordprocessingml/2006/main" xmlns:w14="http://schemas.microsoft.com/office/word/2010/wordml" xmlns:w15="http://schemas.microsoft.com/office/word/2012/wordml" xmlns:w16cex="http://schemas.microsoft.com/office/word/2018/wordml/cex" xmlns:w16cid="http://schemas.microsoft.com/office/word/2016/wordml/cid" xmlns:w16="http://schemas.microsoft.com/office/word/2018/wordml" xmlns:w16sdtdh="http://schemas.microsoft.com/office/word/2020/wordml/sdtdatahash" xmlns:w16se="http://schemas.microsoft.com/office/word/2015/wordml/symex" xmlns:wpg="http://schemas.microsoft.com/office/word/2010/wordprocessingGroup" xmlns:wpi="http://schemas.microsoft.com/office/word/2010/wordprocessingInk" xmlns:wne="http://schemas.microsoft.com/office/word/2006/wordml" xmlns:wps="http://schemas.microsoft.com/office/word/2010/wordprocessingShape" mc:Ignorable="w14 w15 w16se w16cid w16 w16cex w16sdtdh wp14">
   <w:p>
     <w:pPr>
-      <w:pStyle w:val="Header"/>
+      <w:ind w:right="4"/>
+      <w:jc w:val="center"/>
+      <w:rPr>
+        <w:sz w:val="16"/>
+        <w:szCs w:val="16"/>
+      </w:rPr>
     </w:pPr>
+  </w:p>
+  <w:p>
+    <w:pPr>
+      <w:ind w:right="4"/>
+      <w:jc w:val="center"/>
+      <w:rPr>
+        <w:sz w:val="16"/>
+        <w:szCs w:val="16"/>
+      </w:rPr>
+    </w:pPr>
+    <w:r>
+      <w:rPr>
+        <w:noProof/>
+        <w:sz w:val="16"/>
+        <w:szCs w:val="16"/>
+      </w:rPr>
+      <mc:AlternateContent>
+        <mc:Choice Requires="wps">
+          <w:drawing>
+            <wp:anchor distT="0" distB="0" distL="114300" distR="114300" simplePos="0" relativeHeight="251660288" behindDoc="0" locked="0" layoutInCell="1" allowOverlap="1" wp14:anchorId="0782ABA6" wp14:editId="0C94A939">
+              <wp:simplePos x="0" y="0"/>
+              <wp:positionH relativeFrom="column">
+                <wp:posOffset>-882650</wp:posOffset>
+              </wp:positionH>
+              <wp:positionV relativeFrom="paragraph">
+                <wp:posOffset>169545</wp:posOffset>
+              </wp:positionV>
+              <wp:extent cx="7683500" cy="0"/>
+              <wp:effectExtent l="0" t="0" r="0" b="0"/>
+              <wp:wrapNone/>
+              <wp:docPr id="2" name="Straight Connector 2"/>
+              <wp:cNvGraphicFramePr/>
+              <a:graphic xmlns:a="http://schemas.openxmlformats.org/drawingml/2006/main">
+                <a:graphicData uri="http://schemas.microsoft.com/office/word/2010/wordprocessingShape">
+                  <wps:wsp>
+                    <wps:cNvCnPr/>
+                    <wps:spPr>
+                      <a:xfrm>
+                        <a:off x="0" y="0"/>
+                        <a:ext cx="7683500" cy="0"/>
+                      </a:xfrm>
+                      <a:prstGeom prst="line">
+                        <a:avLst/>
+                      </a:prstGeom>
+                      <a:ln/>
+                    </wps:spPr>
+                    <wps:style>
+                      <a:lnRef idx="3">
+                        <a:schemeClr val="dk1"/>
+                      </a:lnRef>
+                      <a:fillRef idx="0">
+                        <a:schemeClr val="dk1"/>
+                      </a:fillRef>
+                      <a:effectRef idx="2">
+                        <a:schemeClr val="dk1"/>
+                      </a:effectRef>
+                      <a:fontRef idx="minor">
+                        <a:schemeClr val="tx1"/>
+                      </a:fontRef>
+                    </wps:style>
+                    <wps:bodyPr/>
+                  </wps:wsp>
+                </a:graphicData>
+              </a:graphic>
+            </wp:anchor>
+          </w:drawing>
+        </mc:Choice>
+        <mc:Fallback>
+          <w:pict>
+            <v:line w14:anchorId="400D5DFC" id="Straight Connector 2" o:spid="_x0000_s1026" style="position:absolute;z-index:251660288;visibility:visible;mso-wrap-style:square;mso-wrap-distance-left:9pt;mso-wrap-distance-top:0;mso-wrap-distance-right:9pt;mso-wrap-distance-bottom:0;mso-position-horizontal:absolute;mso-position-horizontal-relative:text;mso-position-vertical:absolute;mso-position-vertical-relative:text" from="-69.5pt,13.35pt" to="535.5pt,13.35pt" o:gfxdata="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" strokecolor="black [3200]" strokeweight="1.5pt">
+              <v:stroke joinstyle="miter"/>
+            </v:line>
+          </w:pict>
+        </mc:Fallback>
+      </mc:AlternateContent>
+    </w:r>
+  </w:p>
+  <w:p>
+    <w:pPr>
+      <w:ind w:right="4"/>
+      <w:jc w:val="center"/>
+      <w:rPr>
+        <w:sz w:val="16"/>
+        <w:szCs w:val="16"/>
+      </w:rPr>
+    </w:pPr>
+    <w:r>
+      <w:rPr>
+        <w:b/>
+        <w:bCs/>
+        <w:sz w:val="36"/>
+        <w:szCs w:val="36"/>
+      </w:rPr>
+      <w:tab/>
+    </w:r>
   </w:p>
 </w:hdr>
 </file>

</xml_diff>

<commit_message>
fix(skpi): perbarui template SKPI Word untuk penyesuaian jarak pengesahan
</commit_message>
<xml_diff>
--- a/public/FIXED TEMPLATE SKPI USH ver.2003.docx
+++ b/public/FIXED TEMPLATE SKPI USH ver.2003.docx
@@ -1615,9 +1615,6 @@
               <w:pStyle w:val="ListParagraph"/>
               <w:ind w:left="0" w:right="715"/>
             </w:pPr>
-            <w:r>
-              <w:t>Sugeng Hartono University</w:t>
-            </w:r>
           </w:p>
         </w:tc>
       </w:tr>
@@ -2302,7 +2299,7 @@
               <w:ind w:left="0" w:right="715"/>
             </w:pPr>
             <w:r>
-              <w:t>${NO_AKREDITASI_PT}</w:t>
+              <w:t>1727/SK/BAN-PT/Ak-PNB/PT/VIII/2024</w:t>
             </w:r>
           </w:p>
         </w:tc>
@@ -5437,7 +5434,7 @@
       </w:tr>
       <w:tr>
         <w:trPr>
-          <w:trHeight w:val="1781"/>
+          <w:trHeight w:val="1097"/>
         </w:trPr>
         <w:tc>
           <w:tcPr>
@@ -5446,25 +5443,6 @@
           <w:p>
             <w:pPr>
               <w:spacing w:line="360" w:lineRule="auto"/>
-              <w:jc w:val="center"/>
-              <w:rPr>
-                <w:w w:val="91"/>
-              </w:rPr>
-            </w:pPr>
-          </w:p>
-          <w:p>
-            <w:pPr>
-              <w:spacing w:line="360" w:lineRule="auto"/>
-              <w:jc w:val="center"/>
-              <w:rPr>
-                <w:w w:val="91"/>
-              </w:rPr>
-            </w:pPr>
-          </w:p>
-          <w:p>
-            <w:pPr>
-              <w:spacing w:line="360" w:lineRule="auto"/>
-              <w:jc w:val="center"/>
               <w:rPr>
                 <w:w w:val="91"/>
               </w:rPr>
@@ -5676,6 +5654,7 @@
               <w:rPr>
                 <w:rFonts w:eastAsia="Quattrocento Sans"/>
               </w:rPr>
+              <w:lastRenderedPageBreak/>
               <w:t xml:space="preserve">SKPI  </w:t>
             </w:r>
             <w:proofErr w:type="spellStart"/>
@@ -7785,7 +7764,33 @@
         <w:rPr>
           <w:w w:val="91"/>
         </w:rPr>
-        <w:t xml:space="preserve">Sangat Baik = &gt;251 SKP </w:t>
+        <w:t xml:space="preserve">Sangat </w:t>
+      </w:r>
+      <w:proofErr w:type="spellStart"/>
+      <w:r>
+        <w:rPr>
+          <w:w w:val="91"/>
+        </w:rPr>
+        <w:t>Baik</w:t>
+      </w:r>
+      <w:proofErr w:type="spellEnd"/>
+      <w:r>
+        <w:rPr>
+          <w:w w:val="91"/>
+        </w:rPr>
+        <w:t xml:space="preserve"> = &gt;</w:t>
+      </w:r>
+      <w:r>
+        <w:rPr>
+          <w:w w:val="91"/>
+        </w:rPr>
+        <w:t>450</w:t>
+      </w:r>
+      <w:r>
+        <w:rPr>
+          <w:w w:val="91"/>
+        </w:rPr>
+        <w:t xml:space="preserve"> SKP </w:t>
       </w:r>
     </w:p>
     <w:p>
@@ -7795,11 +7800,43 @@
           <w:w w:val="91"/>
         </w:rPr>
       </w:pPr>
+      <w:proofErr w:type="spellStart"/>
       <w:r>
         <w:rPr>
           <w:w w:val="91"/>
         </w:rPr>
-        <w:t xml:space="preserve">Baik = 151–250 SKP </w:t>
+        <w:t>Baik</w:t>
+      </w:r>
+      <w:proofErr w:type="spellEnd"/>
+      <w:r>
+        <w:rPr>
+          <w:w w:val="91"/>
+        </w:rPr>
+        <w:t xml:space="preserve"> = </w:t>
+      </w:r>
+      <w:r>
+        <w:rPr>
+          <w:w w:val="91"/>
+        </w:rPr>
+        <w:t>300</w:t>
+      </w:r>
+      <w:r>
+        <w:rPr>
+          <w:w w:val="91"/>
+        </w:rPr>
+        <w:t>–</w:t>
+      </w:r>
+      <w:r>
+        <w:rPr>
+          <w:w w:val="91"/>
+        </w:rPr>
+        <w:t>4</w:t>
+      </w:r>
+      <w:r>
+        <w:rPr>
+          <w:w w:val="91"/>
+        </w:rPr>
+        <w:t xml:space="preserve">50 SKP </w:t>
       </w:r>
     </w:p>
     <w:p>
@@ -7809,11 +7846,31 @@
           <w:w w:val="91"/>
         </w:rPr>
       </w:pPr>
+      <w:proofErr w:type="spellStart"/>
       <w:r>
         <w:rPr>
           <w:w w:val="91"/>
         </w:rPr>
-        <w:t>Cukup = 80–150 SKP</w:t>
+        <w:t>Cukup</w:t>
+      </w:r>
+      <w:proofErr w:type="spellEnd"/>
+      <w:r>
+        <w:rPr>
+          <w:w w:val="91"/>
+        </w:rPr>
+        <w:t xml:space="preserve"> = </w:t>
+      </w:r>
+      <w:r>
+        <w:rPr>
+          <w:w w:val="91"/>
+        </w:rPr>
+        <w:t>300</w:t>
+      </w:r>
+      <w:r>
+        <w:rPr>
+          <w:w w:val="91"/>
+        </w:rPr>
+        <w:t xml:space="preserve"> SKP</w:t>
       </w:r>
     </w:p>
     <w:p>

</xml_diff>